<commit_message>
Fix theme shading, blockquotes, dual-align, image alt text, and region run styling for body regions
</commit_message>
<xml_diff>
--- a/docs/examples/showcase.docx
+++ b/docs/examples/showcase.docx
@@ -3,17 +3,19 @@
 <w:document xmlns:wpc="http://schemas.microsoft.com/office/word/2010/wordprocessingCanvas" xmlns:mo="http://schemas.microsoft.com/office/mac/office/2008/main" xmlns:mc="http://schemas.openxmlformats.org/markup-compatibility/2006" xmlns:mv="urn:schemas-microsoft-com:mac:vml" xmlns:o="urn:schemas-microsoft-com:office:office" xmlns:r="http://schemas.openxmlformats.org/officeDocument/2006/relationships" xmlns:m="http://schemas.openxmlformats.org/officeDocument/2006/math" xmlns:v="urn:schemas-microsoft-com:vml" xmlns:wp14="http://schemas.microsoft.com/office/word/2010/wordprocessingDrawing" xmlns:wp="http://schemas.openxmlformats.org/drawingml/2006/wordprocessingDrawing" xmlns:w10="urn:schemas-microsoft-com:office:word" xmlns:w="http://schemas.openxmlformats.org/wordprocessingml/2006/main" xmlns:w14="http://schemas.microsoft.com/office/word/2010/wordml" xmlns:wpg="http://schemas.microsoft.com/office/word/2010/wordprocessingGroup" xmlns:wpi="http://schemas.microsoft.com/office/word/2010/wordprocessingInk" xmlns:wne="http://schemas.microsoft.com/office/word/2006/wordml" xmlns:wps="http://schemas.microsoft.com/office/word/2010/wordprocessingShape" mc:Ignorable="w14 wp14">
   <w:body>
     <w:p>
+      <w:bookmarkStart w:id="0" w:name="mark2word-style-gallery"/>
       <w:pPr>
         <w:pStyle w:val="Heading1"/>
-        <w:spacing w:before="0" w:after="0"/>
+        <w:spacing w:after="0"/>
         <w:jc w:val="center"/>
       </w:pPr>
+      <w:bookmarkEnd w:id="0"/>
       <w:r>
         <w:rPr>
           <w:rFonts w:ascii="Aptos" w:hAnsi="Aptos"/>
           <w:b/>
           <w:color w:val="1F497D"/>
-          <w:sz w:val="52"/>
+          <w:sz w:val="56"/>
         </w:rPr>
         <w:t>mark2word Style Gallery</w:t>
       </w:r>
@@ -30,10 +32,11 @@
           <w:color w:val="5B5B5B"/>
           <w:sz w:val="20"/>
         </w:rPr>
-        <w:t>A sample of themed Markdown → Word conversion</w:t>
+        <w:t>Themed Markdown → polished Word · docs/examples/showcase.md</w:t>
       </w:r>
     </w:p>
     <w:p>
+      <w:bookmarkStart w:id="1" w:name="at-a-glance"/>
       <w:pPr>
         <w:pStyle w:val="Heading2"/>
         <w:pBdr>
@@ -41,6 +44,264 @@
         </w:pBdr>
         <w:spacing w:before="320" w:after="0"/>
       </w:pPr>
+      <w:bookmarkEnd w:id="1"/>
+      <w:r>
+        <w:rPr>
+          <w:rFonts w:ascii="Calibri" w:hAnsi="Calibri"/>
+          <w:b/>
+          <w:color w:val="2B579A"/>
+          <w:sz w:val="32"/>
+        </w:rPr>
+        <w:t>At a Glance</w:t>
+      </w:r>
+    </w:p>
+    <w:p>
+      <w:pPr>
+        <w:pStyle w:val="Mark2wordBody"/>
+        <w:spacing w:line="269" w:lineRule="auto" w:before="120" w:after="0"/>
+      </w:pPr>
+      <w:r>
+        <w:t>This document is a living catalog of what mark2word can render. Jump to any section:</w:t>
+      </w:r>
+    </w:p>
+    <w:p>
+      <w:pPr>
+        <w:pStyle w:val="ListBullet"/>
+        <w:numPr>
+          <w:ilvl w:val="0"/>
+          <w:numId w:val="10"/>
+        </w:numPr>
+        <w:spacing w:before="80" w:after="0"/>
+      </w:pPr>
+      <w:hyperlink w:anchor="inline-markup">
+        <w:r>
+          <w:rPr>
+            <w:color w:val="1A1A1A"/>
+            <w:u w:val="single"/>
+          </w:rPr>
+          <w:t xml:space="preserve">Inline markup</w:t>
+        </w:r>
+      </w:hyperlink>
+      <w:r>
+        <w:rPr>
+          <w:rFonts w:ascii="Calibri" w:hAnsi="Calibri"/>
+          <w:color w:val="1A1A1A"/>
+          <w:sz w:val="22"/>
+        </w:rPr>
+        <w:t xml:space="preserve"> — emphasis, links, dual-align</w:t>
+      </w:r>
+    </w:p>
+    <w:p>
+      <w:pPr>
+        <w:pStyle w:val="ListBullet"/>
+        <w:numPr>
+          <w:ilvl w:val="0"/>
+          <w:numId w:val="10"/>
+        </w:numPr>
+        <w:spacing w:before="60" w:after="0"/>
+      </w:pPr>
+      <w:hyperlink w:anchor="lists">
+        <w:r>
+          <w:rPr>
+            <w:color w:val="1A1A1A"/>
+            <w:u w:val="single"/>
+          </w:rPr>
+          <w:t xml:space="preserve">Lists</w:t>
+        </w:r>
+      </w:hyperlink>
+      <w:r>
+        <w:rPr>
+          <w:rFonts w:ascii="Calibri" w:hAnsi="Calibri"/>
+          <w:color w:val="1A1A1A"/>
+          <w:sz w:val="22"/>
+        </w:rPr>
+        <w:t xml:space="preserve"> — nested bullets and numbers</w:t>
+      </w:r>
+    </w:p>
+    <w:p>
+      <w:pPr>
+        <w:pStyle w:val="ListBullet"/>
+        <w:numPr>
+          <w:ilvl w:val="0"/>
+          <w:numId w:val="10"/>
+        </w:numPr>
+        <w:spacing w:before="60" w:after="0"/>
+      </w:pPr>
+      <w:hyperlink w:anchor="images-and-tables">
+        <w:r>
+          <w:rPr>
+            <w:color w:val="1A1A1A"/>
+            <w:u w:val="single"/>
+          </w:rPr>
+          <w:t xml:space="preserve">Images &amp; tables</w:t>
+        </w:r>
+      </w:hyperlink>
+      <w:r>
+        <w:rPr>
+          <w:rFonts w:ascii="Calibri" w:hAnsi="Calibri"/>
+          <w:color w:val="1A1A1A"/>
+          <w:sz w:val="22"/>
+        </w:rPr>
+        <w:t xml:space="preserve"> — layout and cell styling</w:t>
+      </w:r>
+    </w:p>
+    <w:p>
+      <w:pPr>
+        <w:pStyle w:val="ListBullet"/>
+        <w:numPr>
+          <w:ilvl w:val="0"/>
+          <w:numId w:val="10"/>
+        </w:numPr>
+        <w:spacing w:before="60" w:after="0"/>
+      </w:pPr>
+      <w:hyperlink w:anchor="code-blocks">
+        <w:r>
+          <w:rPr>
+            <w:color w:val="1A1A1A"/>
+            <w:u w:val="single"/>
+          </w:rPr>
+          <w:t xml:space="preserve">Code</w:t>
+        </w:r>
+      </w:hyperlink>
+      <w:r>
+        <w:rPr>
+          <w:rFonts w:ascii="Calibri" w:hAnsi="Calibri"/>
+          <w:color w:val="1A1A1A"/>
+          <w:sz w:val="22"/>
+        </w:rPr>
+        <w:t xml:space="preserve"> — fenced blocks with language themes</w:t>
+      </w:r>
+    </w:p>
+    <w:p>
+      <w:pPr>
+        <w:pStyle w:val="ListBullet"/>
+        <w:numPr>
+          <w:ilvl w:val="0"/>
+          <w:numId w:val="10"/>
+        </w:numPr>
+        <w:spacing w:before="60" w:after="0"/>
+      </w:pPr>
+      <w:hyperlink w:anchor="theme-regions">
+        <w:r>
+          <w:rPr>
+            <w:color w:val="1A1A1A"/>
+            <w:u w:val="single"/>
+          </w:rPr>
+          <w:t xml:space="preserve">Theme regions</w:t>
+        </w:r>
+      </w:hyperlink>
+      <w:r>
+        <w:rPr>
+          <w:rFonts w:ascii="Calibri" w:hAnsi="Calibri"/>
+          <w:color w:val="1A1A1A"/>
+          <w:sz w:val="22"/>
+        </w:rPr>
+        <w:t xml:space="preserve"> — local overrides without touching body text</w:t>
+      </w:r>
+    </w:p>
+    <w:p>
+      <w:pPr>
+        <w:pStyle w:val="Mark2wordBody"/>
+        <w:spacing w:line="269" w:lineRule="auto" w:before="120" w:after="0"/>
+      </w:pPr>
+      <w:r>
+        <w:t xml:space="preserve">The </w:t>
+      </w:r>
+      <w:r>
+        <w:rPr>
+          <w:rFonts w:ascii="Calibri" w:hAnsi="Calibri"/>
+          <w:b/>
+          <w:color w:val="1A1A1A"/>
+          <w:sz w:val="22"/>
+        </w:rPr>
+        <w:t>page header and footer</w:t>
+      </w:r>
+      <w:r>
+        <w:t xml:space="preserve"> on every sheet come from the theme (</w:t>
+      </w:r>
+      <w:r>
+        <w:rPr>
+          <w:shd w:val="clear" w:color="auto" w:fill="F5F5F5"/>
+          <w:rFonts w:ascii="Consolas" w:hAnsi="Consolas"/>
+          <w:color w:val="1F497D"/>
+          <w:sz w:val="18"/>
+        </w:rPr>
+        <w:t>page.header</w:t>
+      </w:r>
+      <w:r>
+        <w:t xml:space="preserve"> / </w:t>
+      </w:r>
+      <w:r>
+        <w:rPr>
+          <w:shd w:val="clear" w:color="auto" w:fill="F5F5F5"/>
+          <w:rFonts w:ascii="Consolas" w:hAnsi="Consolas"/>
+          <w:color w:val="1F497D"/>
+          <w:sz w:val="18"/>
+        </w:rPr>
+        <w:t>page.footer</w:t>
+      </w:r>
+      <w:r>
+        <w:t xml:space="preserve"> with </w:t>
+      </w:r>
+      <w:r>
+        <w:rPr>
+          <w:shd w:val="clear" w:color="auto" w:fill="F5F5F5"/>
+          <w:rFonts w:ascii="Consolas" w:hAnsi="Consolas"/>
+          <w:color w:val="1F497D"/>
+          <w:sz w:val="18"/>
+        </w:rPr>
+        <w:t>{title}</w:t>
+      </w:r>
+      <w:r>
+        <w:t xml:space="preserve">, </w:t>
+      </w:r>
+      <w:r>
+        <w:rPr>
+          <w:shd w:val="clear" w:color="auto" w:fill="F5F5F5"/>
+          <w:rFonts w:ascii="Consolas" w:hAnsi="Consolas"/>
+          <w:color w:val="1F497D"/>
+          <w:sz w:val="18"/>
+        </w:rPr>
+        <w:t>{page}</w:t>
+      </w:r>
+      <w:r>
+        <w:t xml:space="preserve">, and </w:t>
+      </w:r>
+      <w:r>
+        <w:rPr>
+          <w:shd w:val="clear" w:color="auto" w:fill="F5F5F5"/>
+          <w:rFonts w:ascii="Consolas" w:hAnsi="Consolas"/>
+          <w:color w:val="1F497D"/>
+          <w:sz w:val="18"/>
+        </w:rPr>
+        <w:t>{pages}</w:t>
+      </w:r>
+      <w:r>
+        <w:t xml:space="preserve">). The centered line at the very end of this file is a </w:t>
+      </w:r>
+      <w:r>
+        <w:rPr>
+          <w:rFonts w:ascii="Calibri" w:hAnsi="Calibri"/>
+          <w:b/>
+          <w:color w:val="1A1A1A"/>
+          <w:sz w:val="22"/>
+        </w:rPr>
+        <w:t>body footer region</w:t>
+      </w:r>
+      <w:r>
+        <w:t xml:space="preserve"> — content you control in Markdown, not Word page chrome.</w:t>
+      </w:r>
+    </w:p>
+    <w:p>
+      <w:bookmarkStart w:id="2" w:name="document-purpose"/>
+      <w:pPr>
+        <w:pStyle w:val="Heading2"/>
+        <w:pBdr>
+          <w:bottom w:val="single" w:sz="6" w:space="2" w:color="2B579A"/>
+        </w:pBdr>
+        <w:spacing w:before="320" w:after="0"/>
+      </w:pPr>
+      <w:bookmarkEnd w:id="2"/>
       <w:r>
         <w:rPr>
           <w:rFonts w:ascii="Calibri" w:hAnsi="Calibri"/>
@@ -54,15 +315,100 @@
     <w:p>
       <w:pPr>
         <w:pStyle w:val="Mark2wordBody"/>
+        <w:spacing w:line="269" w:lineRule="auto" w:before="120" w:after="120"/>
+      </w:pPr>
+      <w:r>
+        <w:t xml:space="preserve">mark2word separates </w:t>
+      </w:r>
+      <w:r>
+        <w:rPr>
+          <w:rFonts w:ascii="Calibri" w:hAnsi="Calibri"/>
+          <w:i/>
+          <w:color w:val="1A1A1A"/>
+          <w:sz w:val="22"/>
+        </w:rPr>
+        <w:t>what you write</w:t>
+      </w:r>
+      <w:r>
+        <w:t xml:space="preserve"> from </w:t>
+      </w:r>
+      <w:r>
+        <w:rPr>
+          <w:rFonts w:ascii="Calibri" w:hAnsi="Calibri"/>
+          <w:i/>
+          <w:color w:val="1A1A1A"/>
+          <w:sz w:val="22"/>
+        </w:rPr>
+        <w:t>how it looks</w:t>
+      </w:r>
+      <w:r>
+        <w:t>. YAML frontmatter, external themes, and invisible HTML comments carry styling; the Markdown body stays readable in GitHub, Obsidian, or any previewer.</w:t>
+      </w:r>
+    </w:p>
+    <w:tbl>
+      <w:tblPr>
+        <w:tblLook w:firstColumn="1" w:firstRow="1" w:lastColumn="0" w:lastRow="0" w:noHBand="0" w:noVBand="1" w:val="04A0"/>
+        <w:tblBorders>
+          <w:top w:val="nil"/>
+          <w:left w:val="nil"/>
+          <w:bottom w:val="nil"/>
+          <w:right w:val="nil"/>
+          <w:insideH w:val="nil"/>
+          <w:insideV w:val="nil"/>
+        </w:tblBorders>
+        <w:tblLayout w:type="fixed"/>
+        <w:tblInd w:w="204" w:type="dxa"/>
+        <w:tblW w:w="10308" w:type="dxa"/>
+      </w:tblPr>
+      <w:tblGrid>
+        <w:gridCol w:w="10368"/>
+      </w:tblGrid>
+      <w:tr>
+        <w:tc>
+          <w:tcPr>
+            <w:tcW w:type="dxa" w:w="10368"/>
+            <w:shd w:val="clear" w:color="auto" w:fill="F0F0F0"/>
+            <w:tcBorders>
+              <w:top w:val="nil"/>
+              <w:left w:val="single" w:sz="24" w:color="D6D6D6" w:space="0"/>
+              <w:bottom w:val="nil"/>
+              <w:right w:val="nil"/>
+            </w:tcBorders>
+            <w:tcMar>
+              <w:top w:w="0" w:type="dxa"/>
+              <w:bottom w:w="0" w:type="dxa"/>
+              <w:left w:w="144" w:type="dxa"/>
+              <w:right w:w="144" w:type="dxa"/>
+            </w:tcMar>
+          </w:tcPr>
+          <w:p>
+            <w:pPr>
+              <w:spacing w:before="0" w:after="0"/>
+            </w:pPr>
+            <w:r>
+              <w:rPr>
+                <w:rFonts w:ascii="Calibri" w:hAnsi="Calibri"/>
+                <w:b/>
+                <w:i/>
+                <w:color w:val="404040"/>
+                <w:sz w:val="22"/>
+              </w:rPr>
+              <w:t>Why it matters.</w:t>
+            </w:r>
+            <w:r>
+              <w:t xml:space="preserve"> Authors draft in plain Markdown. Designers tune one theme file. Agents can regenerate content without rebuilding Word XML by hand — and the same skeleton can become a memo, a proposal, or a report by swapping YAML.</w:t>
+            </w:r>
+          </w:p>
+        </w:tc>
+      </w:tr>
+    </w:tbl>
+    <w:p>
+      <w:pPr>
+        <w:pStyle w:val="Mark2wordBody"/>
         <w:spacing w:line="269" w:lineRule="auto" w:before="120" w:after="0"/>
       </w:pPr>
       <w:r>
-        <w:rPr>
-          <w:rFonts w:ascii="Calibri" w:hAnsi="Calibri"/>
-          <w:color w:val="1A1A1A"/>
-          <w:sz w:val="22"/>
-        </w:rPr>
-        <w:t xml:space="preserve">This document demonstrates how mark2word can take a Markdown document with a little extra invisible style and make it a polished Word file. For </w:t>
+        <w:t xml:space="preserve">For </w:t>
       </w:r>
       <w:r>
         <w:rPr>
@@ -71,15 +417,10 @@
           <w:color w:val="1A1A1A"/>
           <w:sz w:val="22"/>
         </w:rPr>
-        <w:t>human work</w:t>
+        <w:t>human workflows</w:t>
       </w:r>
       <w:r>
-        <w:rPr>
-          <w:rFonts w:ascii="Calibri" w:hAnsi="Calibri"/>
-          <w:color w:val="1A1A1A"/>
-          <w:sz w:val="22"/>
-        </w:rPr>
-        <w:t xml:space="preserve">, it can be an easy way to separate drafting your documents and polishing the style, letting you focus on each separately before you're ready to compile them together into a Word document. For </w:t>
+        <w:t xml:space="preserve">, that means polish without fighting the Word ribbon. For </w:t>
       </w:r>
       <w:r>
         <w:rPr>
@@ -88,36 +429,40 @@
           <w:color w:val="1A1A1A"/>
           <w:sz w:val="22"/>
         </w:rPr>
-        <w:t>working with agents</w:t>
+        <w:t>agent workflows</w:t>
+      </w:r>
+      <w:r>
+        <w:t xml:space="preserve">, it means structured output that compiles to a client-ready </w:t>
       </w:r>
       <w:r>
         <w:rPr>
-          <w:rFonts w:ascii="Calibri" w:hAnsi="Calibri"/>
-          <w:color w:val="1A1A1A"/>
-          <w:sz w:val="22"/>
+          <w:shd w:val="clear" w:color="auto" w:fill="F5F5F5"/>
+          <w:rFonts w:ascii="Consolas" w:hAnsi="Consolas"/>
+          <w:color w:val="1F497D"/>
+          <w:sz w:val="18"/>
         </w:rPr>
-        <w:t>, Markdown provides a simple yet expressive output format, and keeping the style and text separate lets the agent focus on the content of your document rather than writing another Python script or messing with XML.</w:t>
+        <w:t>.docx</w:t>
+      </w:r>
+      <w:r>
+        <w:t>.</w:t>
       </w:r>
     </w:p>
     <w:p>
       <w:pPr>
         <w:pStyle w:val="Mark2wordBody"/>
-        <w:spacing w:line="269" w:lineRule="auto" w:before="80" w:after="0"/>
+        <w:spacing w:line="269" w:lineRule="auto" w:before="280" w:after="0"/>
+        <w:pBdr>
+          <w:bottom w:val="single" w:sz="6" w:space="2" w:color="2B579A"/>
+        </w:pBdr>
       </w:pPr>
-      <w:r>
-        <w:rPr>
-          <w:rFonts w:ascii="Calibri" w:hAnsi="Calibri"/>
-          <w:color w:val="1A1A1A"/>
-          <w:sz w:val="22"/>
-        </w:rPr>
-        <w:t>Plus, since the styling only uses the front-matter, YAML, or comments, the Markdown files still render in any viewer.</w:t>
-      </w:r>
     </w:p>
     <w:p>
+      <w:bookmarkStart w:id="3" w:name="heading-level-three"/>
       <w:pPr>
         <w:pStyle w:val="Heading3"/>
-        <w:spacing w:before="240" w:after="0"/>
+        <w:spacing w:before="280" w:after="0"/>
       </w:pPr>
+      <w:bookmarkEnd w:id="3"/>
       <w:r>
         <w:rPr>
           <w:rFonts w:ascii="Calibri" w:hAnsi="Calibri"/>
@@ -130,10 +475,12 @@
       </w:r>
     </w:p>
     <w:p>
+      <w:bookmarkStart w:id="4" w:name="heading-level-four"/>
       <w:pPr>
         <w:pStyle w:val="Heading4"/>
         <w:spacing w:before="0" w:after="0"/>
       </w:pPr>
+      <w:bookmarkEnd w:id="4"/>
       <w:r>
         <w:rPr>
           <w:rFonts w:ascii="Calibri" w:hAnsi="Calibri"/>
@@ -145,10 +492,12 @@
       </w:r>
     </w:p>
     <w:p>
+      <w:bookmarkStart w:id="5" w:name="heading-level-five"/>
       <w:pPr>
         <w:pStyle w:val="Heading5"/>
         <w:spacing w:before="0" w:after="0"/>
       </w:pPr>
+      <w:bookmarkEnd w:id="5"/>
       <w:r>
         <w:rPr>
           <w:rFonts w:ascii="Calibri" w:hAnsi="Calibri"/>
@@ -160,10 +509,12 @@
       </w:r>
     </w:p>
     <w:p>
+      <w:bookmarkStart w:id="6" w:name="heading-level-six"/>
       <w:pPr>
         <w:pStyle w:val="Heading6"/>
         <w:spacing w:before="0" w:after="0"/>
       </w:pPr>
+      <w:bookmarkEnd w:id="6"/>
       <w:r>
         <w:rPr>
           <w:rFonts w:ascii="Calibri" w:hAnsi="Calibri"/>
@@ -176,6 +527,7 @@
       </w:r>
     </w:p>
     <w:p>
+      <w:bookmarkStart w:id="7" w:name="inline-markup"/>
       <w:pPr>
         <w:pStyle w:val="Heading2"/>
         <w:pBdr>
@@ -183,6 +535,7 @@
         </w:pBdr>
         <w:spacing w:before="320" w:after="0"/>
       </w:pPr>
+      <w:bookmarkEnd w:id="7"/>
       <w:r>
         <w:rPr>
           <w:rFonts w:ascii="Calibri" w:hAnsi="Calibri"/>
@@ -199,12 +552,7 @@
         <w:spacing w:line="269" w:lineRule="auto" w:before="120" w:after="0"/>
       </w:pPr>
       <w:r>
-        <w:rPr>
-          <w:rFonts w:ascii="Calibri" w:hAnsi="Calibri"/>
-          <w:color w:val="1A1A1A"/>
-          <w:sz w:val="22"/>
-        </w:rPr>
-        <w:t xml:space="preserve">A plain body paragraph with </w:t>
+        <w:t xml:space="preserve">A body paragraph with </w:t>
       </w:r>
       <w:r>
         <w:rPr>
@@ -216,11 +564,6 @@
         <w:t>bold</w:t>
       </w:r>
       <w:r>
-        <w:rPr>
-          <w:rFonts w:ascii="Calibri" w:hAnsi="Calibri"/>
-          <w:color w:val="1A1A1A"/>
-          <w:sz w:val="22"/>
-        </w:rPr>
         <w:t xml:space="preserve">, </w:t>
       </w:r>
       <w:r>
@@ -233,11 +576,6 @@
         <w:t>italic</w:t>
       </w:r>
       <w:r>
-        <w:rPr>
-          <w:rFonts w:ascii="Calibri" w:hAnsi="Calibri"/>
-          <w:color w:val="1A1A1A"/>
-          <w:sz w:val="22"/>
-        </w:rPr>
         <w:t xml:space="preserve">, </w:t>
       </w:r>
       <w:r>
@@ -251,11 +589,6 @@
         <w:t>bold italic</w:t>
       </w:r>
       <w:r>
-        <w:rPr>
-          <w:rFonts w:ascii="Calibri" w:hAnsi="Calibri"/>
-          <w:color w:val="1A1A1A"/>
-          <w:sz w:val="22"/>
-        </w:rPr>
         <w:t xml:space="preserve">, </w:t>
       </w:r>
       <w:r>
@@ -268,11 +601,6 @@
         <w:t>underscore italic</w:t>
       </w:r>
       <w:r>
-        <w:rPr>
-          <w:rFonts w:ascii="Calibri" w:hAnsi="Calibri"/>
-          <w:color w:val="1A1A1A"/>
-          <w:sz w:val="22"/>
-        </w:rPr>
         <w:t xml:space="preserve">, </w:t>
       </w:r>
       <w:r>
@@ -285,15 +613,11 @@
         <w:t>underscore bold</w:t>
       </w:r>
       <w:r>
-        <w:rPr>
-          <w:rFonts w:ascii="Calibri" w:hAnsi="Calibri"/>
-          <w:color w:val="1A1A1A"/>
-          <w:sz w:val="22"/>
-        </w:rPr>
         <w:t xml:space="preserve">, and </w:t>
       </w:r>
       <w:r>
         <w:rPr>
+          <w:shd w:val="clear" w:color="auto" w:fill="F5F5F5"/>
           <w:rFonts w:ascii="Consolas" w:hAnsi="Consolas"/>
           <w:color w:val="1F497D"/>
           <w:sz w:val="18"/>
@@ -301,32 +625,57 @@
         <w:t>inline code</w:t>
       </w:r>
       <w:r>
-        <w:rPr>
-          <w:rFonts w:ascii="Calibri" w:hAnsi="Calibri"/>
-          <w:color w:val="1A1A1A"/>
-          <w:sz w:val="22"/>
-        </w:rPr>
-        <w:t xml:space="preserve">. Adding links also works: </w:t>
+        <w:t xml:space="preserve">. External links work: </w:t>
       </w:r>
-      <w:hyperlink r:id="rId9">
+      <w:hyperlink r:id="rId11">
+        <w:r>
+          <w:rPr>
+            <w:color w:val="1A1A1A"/>
+            <w:u w:val="single"/>
+            <w:b/>
+          </w:rPr>
+          <w:t xml:space="preserve">mark2word on GitHub</w:t>
+        </w:r>
+      </w:hyperlink>
+      <w:r>
+        <w:t xml:space="preserve">. Internal links jump to bookmarks on headings — try </w:t>
+      </w:r>
+      <w:hyperlink w:anchor="lists">
         <w:r>
           <w:rPr>
             <w:color w:val="1A1A1A"/>
             <w:u w:val="single"/>
           </w:rPr>
-          <w:t>mark2word on GitHub</w:t>
+          <w:t xml:space="preserve">the lists section</w:t>
         </w:r>
       </w:hyperlink>
       <w:r>
-        <w:rPr>
-          <w:rFonts w:ascii="Calibri" w:hAnsi="Calibri"/>
-          <w:color w:val="1A1A1A"/>
-          <w:sz w:val="22"/>
-        </w:rPr>
-        <w:t xml:space="preserve">. You can even use </w:t>
+        <w:t xml:space="preserve"> or </w:t>
+      </w:r>
+      <w:hyperlink w:anchor="code-blocks">
+        <w:r>
+          <w:rPr>
+            <w:color w:val="1A1A1A"/>
+            <w:u w:val="single"/>
+          </w:rPr>
+          <w:t xml:space="preserve">code blocks</w:t>
+        </w:r>
+      </w:hyperlink>
+      <w:r>
+        <w:t>.</w:t>
+      </w:r>
+    </w:p>
+    <w:p>
+      <w:pPr>
+        <w:pStyle w:val="Mark2wordBody"/>
+        <w:spacing w:line="269" w:lineRule="auto" w:before="80" w:after="0"/>
+      </w:pPr>
+      <w:r>
+        <w:t xml:space="preserve">Dual-aligned lines split on </w:t>
       </w:r>
       <w:r>
         <w:rPr>
+          <w:shd w:val="clear" w:color="auto" w:fill="F5F5F5"/>
           <w:rFonts w:ascii="Consolas" w:hAnsi="Consolas"/>
           <w:color w:val="1F497D"/>
           <w:sz w:val="18"/>
@@ -334,47 +683,33 @@
         <w:t>||</w:t>
       </w:r>
       <w:r>
-        <w:rPr>
-          <w:rFonts w:ascii="Calibri" w:hAnsi="Calibri"/>
-          <w:color w:val="1A1A1A"/>
-          <w:sz w:val="22"/>
-        </w:rPr>
-        <w:t xml:space="preserve"> in the middle of a line to split it into left- and right-aligned sides.</w:t>
+        <w:t xml:space="preserve"> (ignored inside backticks):</w:t>
       </w:r>
     </w:p>
     <w:p>
       <w:pPr>
         <w:pStyle w:val="Mark2wordBody"/>
+        <w:spacing w:line="269" w:lineRule="auto" w:before="80" w:after="0"/>
+        <w:jc w:val="left"/>
         <w:tabs>
-          <w:tab w:pos="10080" w:val="right"/>
+          <w:tab w:val="right" w:leader="none" w:pos="10368"/>
         </w:tabs>
-        <w:spacing w:line="269" w:lineRule="auto" w:before="80" w:after="0"/>
       </w:pPr>
       <w:r>
-        <w:rPr>
-          <w:rFonts w:ascii="Calibri" w:hAnsi="Calibri"/>
-          <w:color w:val="1A1A1A"/>
-          <w:sz w:val="22"/>
-        </w:rPr>
-        <w:t>Left-aligned Text</w:t>
+        <w:t>Left-aligned label</w:t>
       </w:r>
       <w:r>
         <w:tab/>
       </w:r>
       <w:r>
-        <w:rPr>
-          <w:rFonts w:ascii="Calibri" w:hAnsi="Calibri"/>
-          <w:color w:val="1A1A1A"/>
-          <w:sz w:val="22"/>
-        </w:rPr>
-        <w:t>Right-aligned Text</w:t>
+        <w:t>Right-aligned value</w:t>
       </w:r>
     </w:p>
     <w:p>
       <w:pPr>
         <w:pStyle w:val="Mark2wordBody"/>
-        <w:spacing w:line="269" w:lineRule="auto" w:before="160" w:after="0"/>
-        <w:ind w:left="480"/>
+        <w:spacing w:line="269" w:lineRule="auto" w:before="200" w:after="0"/>
+        <w:ind w:left="560" w:right="560"/>
         <w:jc w:val="center"/>
       </w:pPr>
       <w:r>
@@ -384,10 +719,11 @@
           <w:color w:val="943634"/>
           <w:sz w:val="26"/>
         </w:rPr>
-        <w:t>You can even add in custom styling: the same Markdown skeleton can look like a memo, a proposal, or a résumé depending on the YAML you attach.</w:t>
+        <w:t>The same Markdown skeleton can look like a memo, a proposal, or a résumé — swap the theme, keep the words.</w:t>
       </w:r>
     </w:p>
     <w:p>
+      <w:bookmarkStart w:id="8" w:name="lists"/>
       <w:pPr>
         <w:pStyle w:val="Heading2"/>
         <w:pBdr>
@@ -395,6 +731,7 @@
         </w:pBdr>
         <w:spacing w:before="320" w:after="0"/>
       </w:pPr>
+      <w:bookmarkEnd w:id="8"/>
       <w:r>
         <w:rPr>
           <w:rFonts w:ascii="Calibri" w:hAnsi="Calibri"/>
@@ -417,7 +754,58 @@
           <w:color w:val="1A1A1A"/>
           <w:sz w:val="22"/>
         </w:rPr>
-        <w:t>Unordered Lists</w:t>
+        <w:t>Unordered lists</w:t>
+      </w:r>
+      <w:r>
+        <w:t xml:space="preserve"> use theme </w:t>
+      </w:r>
+      <w:r>
+        <w:rPr>
+          <w:shd w:val="clear" w:color="auto" w:fill="F5F5F5"/>
+          <w:rFonts w:ascii="Consolas" w:hAnsi="Consolas"/>
+          <w:color w:val="1F497D"/>
+          <w:sz w:val="18"/>
+        </w:rPr>
+        <w:t>ul</w:t>
+      </w:r>
+      <w:r>
+        <w:t xml:space="preserve"> levels (</w:t>
+      </w:r>
+      <w:r>
+        <w:rPr>
+          <w:shd w:val="clear" w:color="auto" w:fill="F5F5F5"/>
+          <w:rFonts w:ascii="Consolas" w:hAnsi="Consolas"/>
+          <w:color w:val="1F497D"/>
+          <w:sz w:val="18"/>
+        </w:rPr>
+        <w:t>*</w:t>
+      </w:r>
+      <w:r>
+        <w:t xml:space="preserve">, </w:t>
+      </w:r>
+      <w:r>
+        <w:rPr>
+          <w:shd w:val="clear" w:color="auto" w:fill="F5F5F5"/>
+          <w:rFonts w:ascii="Consolas" w:hAnsi="Consolas"/>
+          <w:color w:val="1F497D"/>
+          <w:sz w:val="18"/>
+        </w:rPr>
+        <w:t>o</w:t>
+      </w:r>
+      <w:r>
+        <w:t xml:space="preserve">, </w:t>
+      </w:r>
+      <w:r>
+        <w:rPr>
+          <w:shd w:val="clear" w:color="auto" w:fill="F5F5F5"/>
+          <w:rFonts w:ascii="Consolas" w:hAnsi="Consolas"/>
+          <w:color w:val="1F497D"/>
+          <w:sz w:val="18"/>
+        </w:rPr>
+        <w:t>-</w:t>
+      </w:r>
+      <w:r>
+        <w:t xml:space="preserve"> at depth):</w:t>
       </w:r>
     </w:p>
     <w:p>
@@ -425,7 +813,7 @@
         <w:pStyle w:val="ListBullet"/>
         <w:numPr>
           <w:ilvl w:val="0"/>
-          <w:numId w:val="10"/>
+          <w:numId w:val="11"/>
         </w:numPr>
         <w:spacing w:before="80" w:after="0"/>
       </w:pPr>
@@ -435,7 +823,7 @@
           <w:color w:val="1A1A1A"/>
           <w:sz w:val="22"/>
         </w:rPr>
-        <w:t>Markdown unordered lists</w:t>
+        <w:t>Top-level bullet</w:t>
       </w:r>
     </w:p>
     <w:p>
@@ -443,7 +831,7 @@
         <w:pStyle w:val="ListBullet"/>
         <w:numPr>
           <w:ilvl w:val="0"/>
-          <w:numId w:val="10"/>
+          <w:numId w:val="11"/>
         </w:numPr>
         <w:spacing w:before="60" w:after="0"/>
       </w:pPr>
@@ -453,7 +841,7 @@
           <w:color w:val="1A1A1A"/>
           <w:sz w:val="22"/>
         </w:rPr>
-        <w:t>work just like you would expect,</w:t>
+        <w:t>second item</w:t>
       </w:r>
     </w:p>
     <w:p>
@@ -461,7 +849,7 @@
         <w:pStyle w:val="ListBullet"/>
         <w:numPr>
           <w:ilvl w:val="1"/>
-          <w:numId w:val="10"/>
+          <w:numId w:val="11"/>
         </w:numPr>
         <w:spacing w:before="60" w:after="0"/>
       </w:pPr>
@@ -471,15 +859,15 @@
           <w:color w:val="1A1A1A"/>
           <w:sz w:val="22"/>
         </w:rPr>
-        <w:t>and nested bullets inherit list indentation.</w:t>
+        <w:t>nested level one</w:t>
       </w:r>
     </w:p>
     <w:p>
       <w:pPr>
         <w:pStyle w:val="ListBullet"/>
         <w:numPr>
-          <w:ilvl w:val="1"/>
-          <w:numId w:val="10"/>
+          <w:ilvl w:val="2"/>
+          <w:numId w:val="11"/>
         </w:numPr>
         <w:spacing w:before="60" w:after="0"/>
       </w:pPr>
@@ -489,23 +877,7 @@
           <w:color w:val="1A1A1A"/>
           <w:sz w:val="22"/>
         </w:rPr>
-        <w:t xml:space="preserve">Their styling comes from the </w:t>
-      </w:r>
-      <w:r>
-        <w:rPr>
-          <w:rFonts w:ascii="Consolas" w:hAnsi="Consolas"/>
-          <w:color w:val="1F497D"/>
-          <w:sz w:val="18"/>
-        </w:rPr>
-        <w:t>list</w:t>
-      </w:r>
-      <w:r>
-        <w:rPr>
-          <w:rFonts w:ascii="Calibri" w:hAnsi="Calibri"/>
-          <w:color w:val="1A1A1A"/>
-          <w:sz w:val="22"/>
-        </w:rPr>
-        <w:t xml:space="preserve"> theme block.</w:t>
+        <w:t>nested level two</w:t>
       </w:r>
     </w:p>
     <w:p>
@@ -513,7 +885,7 @@
         <w:pStyle w:val="ListBullet"/>
         <w:numPr>
           <w:ilvl w:val="0"/>
-          <w:numId w:val="10"/>
+          <w:numId w:val="11"/>
         </w:numPr>
         <w:spacing w:before="60" w:after="0"/>
       </w:pPr>
@@ -523,7 +895,7 @@
           <w:color w:val="1A1A1A"/>
           <w:sz w:val="22"/>
         </w:rPr>
-        <w:t>Making it easy to use!</w:t>
+        <w:t>back to top level</w:t>
       </w:r>
     </w:p>
     <w:p>
@@ -538,93 +910,58 @@
           <w:color w:val="1A1A1A"/>
           <w:sz w:val="22"/>
         </w:rPr>
-        <w:t>Ordered Lists</w:t>
+        <w:t>Ordered lists</w:t>
       </w:r>
-    </w:p>
-    <w:p>
-      <w:pPr>
-        <w:pStyle w:val="ListNumber"/>
-        <w:numPr>
-          <w:ilvl w:val="0"/>
-          <w:numId w:val="11"/>
-        </w:numPr>
-        <w:spacing w:before="80" w:after="0"/>
-      </w:pPr>
+      <w:r>
+        <w:t xml:space="preserve"> use </w:t>
+      </w:r>
       <w:r>
         <w:rPr>
-          <w:rFonts w:ascii="Calibri" w:hAnsi="Calibri"/>
-          <w:color w:val="1A1A1A"/>
-          <w:sz w:val="22"/>
+          <w:shd w:val="clear" w:color="auto" w:fill="F5F5F5"/>
+          <w:rFonts w:ascii="Consolas" w:hAnsi="Consolas"/>
+          <w:color w:val="1F497D"/>
+          <w:sz w:val="18"/>
         </w:rPr>
-        <w:t>Markdown ordered lists</w:t>
+        <w:t>ol</w:t>
       </w:r>
-    </w:p>
-    <w:p>
-      <w:pPr>
-        <w:pStyle w:val="ListNumber"/>
-        <w:numPr>
-          <w:ilvl w:val="0"/>
-          <w:numId w:val="11"/>
-        </w:numPr>
-        <w:spacing w:before="60" w:after="0"/>
-      </w:pPr>
+      <w:r>
+        <w:t xml:space="preserve"> levels (</w:t>
+      </w:r>
       <w:r>
         <w:rPr>
-          <w:rFonts w:ascii="Calibri" w:hAnsi="Calibri"/>
-          <w:color w:val="1A1A1A"/>
-          <w:sz w:val="22"/>
+          <w:shd w:val="clear" w:color="auto" w:fill="F5F5F5"/>
+          <w:rFonts w:ascii="Consolas" w:hAnsi="Consolas"/>
+          <w:color w:val="1F497D"/>
+          <w:sz w:val="18"/>
         </w:rPr>
-        <w:t>also work as expected.</w:t>
+        <w:t>1.</w:t>
       </w:r>
-    </w:p>
-    <w:p>
-      <w:pPr>
-        <w:pStyle w:val="ListNumber"/>
-        <w:numPr>
-          <w:ilvl w:val="1"/>
-          <w:numId w:val="11"/>
-        </w:numPr>
-        <w:spacing w:before="60" w:after="0"/>
-      </w:pPr>
+      <w:r>
+        <w:t xml:space="preserve">, </w:t>
+      </w:r>
       <w:r>
         <w:rPr>
-          <w:rFonts w:ascii="Calibri" w:hAnsi="Calibri"/>
-          <w:color w:val="1A1A1A"/>
-          <w:sz w:val="22"/>
+          <w:shd w:val="clear" w:color="auto" w:fill="F5F5F5"/>
+          <w:rFonts w:ascii="Consolas" w:hAnsi="Consolas"/>
+          <w:color w:val="1F497D"/>
+          <w:sz w:val="18"/>
         </w:rPr>
-        <w:t>Nested lists too!</w:t>
+        <w:t>a.</w:t>
       </w:r>
-    </w:p>
-    <w:p>
-      <w:pPr>
-        <w:pStyle w:val="ListNumber"/>
-        <w:numPr>
-          <w:ilvl w:val="0"/>
-          <w:numId w:val="11"/>
-        </w:numPr>
-        <w:spacing w:before="60" w:after="0"/>
-      </w:pPr>
+      <w:r>
+        <w:t xml:space="preserve">, </w:t>
+      </w:r>
       <w:r>
         <w:rPr>
-          <w:rFonts w:ascii="Calibri" w:hAnsi="Calibri"/>
-          <w:color w:val="1A1A1A"/>
-          <w:sz w:val="22"/>
+          <w:shd w:val="clear" w:color="auto" w:fill="F5F5F5"/>
+          <w:rFonts w:ascii="Consolas" w:hAnsi="Consolas"/>
+          <w:color w:val="1F497D"/>
+          <w:sz w:val="18"/>
         </w:rPr>
-        <w:t>But look what happens if you split the list.</w:t>
+        <w:t>i.</w:t>
       </w:r>
-    </w:p>
-    <w:p>
-      <w:pPr>
-        <w:pStyle w:val="Mark2wordBody"/>
-        <w:spacing w:line="269" w:lineRule="auto" w:before="120" w:after="0"/>
-      </w:pPr>
       <w:r>
-        <w:rPr>
-          <w:rFonts w:ascii="Calibri" w:hAnsi="Calibri"/>
-          <w:color w:val="1A1A1A"/>
-          <w:sz w:val="22"/>
-        </w:rPr>
-        <w:t>A body paragraph between lists restarts numbering.</w:t>
+        <w:t>):</w:t>
       </w:r>
     </w:p>
     <w:p>
@@ -642,7 +979,7 @@
           <w:color w:val="1A1A1A"/>
           <w:sz w:val="22"/>
         </w:rPr>
-        <w:t>The first number of the list sets the start value for the ordered run,</w:t>
+        <w:t>First top-level item</w:t>
       </w:r>
     </w:p>
     <w:p>
@@ -660,25 +997,61 @@
           <w:color w:val="1A1A1A"/>
           <w:sz w:val="22"/>
         </w:rPr>
-        <w:t>and the numbering continues within the new run.</w:t>
+        <w:t>Second item</w:t>
       </w:r>
     </w:p>
     <w:p>
       <w:pPr>
-        <w:pStyle w:val="Heading2"/>
-        <w:pBdr>
-          <w:bottom w:val="single" w:sz="6" w:space="2" w:color="2B579A"/>
-        </w:pBdr>
-        <w:spacing w:before="320" w:after="0"/>
+        <w:pStyle w:val="ListNumber"/>
+        <w:numPr>
+          <w:ilvl w:val="1"/>
+          <w:numId w:val="12"/>
+        </w:numPr>
+        <w:spacing w:before="60" w:after="0"/>
       </w:pPr>
       <w:r>
         <w:rPr>
           <w:rFonts w:ascii="Calibri" w:hAnsi="Calibri"/>
-          <w:b/>
-          <w:color w:val="2B579A"/>
-          <w:sz w:val="32"/>
+          <w:color w:val="1A1A1A"/>
+          <w:sz w:val="22"/>
         </w:rPr>
-        <w:t>Images</w:t>
+        <w:t>Nested ordered (letter format at depth 1 in theme)</w:t>
+      </w:r>
+    </w:p>
+    <w:p>
+      <w:pPr>
+        <w:pStyle w:val="ListNumber"/>
+        <w:numPr>
+          <w:ilvl w:val="1"/>
+          <w:numId w:val="12"/>
+        </w:numPr>
+        <w:spacing w:before="60" w:after="0"/>
+      </w:pPr>
+      <w:r>
+        <w:rPr>
+          <w:rFonts w:ascii="Calibri" w:hAnsi="Calibri"/>
+          <w:color w:val="1A1A1A"/>
+          <w:sz w:val="22"/>
+        </w:rPr>
+        <w:t>Another nested item</w:t>
+      </w:r>
+    </w:p>
+    <w:p>
+      <w:pPr>
+        <w:pStyle w:val="ListNumber"/>
+        <w:numPr>
+          <w:ilvl w:val="0"/>
+          <w:numId w:val="12"/>
+        </w:numPr>
+        <w:spacing w:before="60" w:after="0"/>
+      </w:pPr>
+      <w:r>
+        <w:rPr>
+          <w:rFonts w:ascii="Calibri" w:hAnsi="Calibri"/>
+          <w:color w:val="1A1A1A"/>
+          <w:sz w:val="22"/>
+        </w:rPr>
+        <w:t>Third top-level item</w:t>
       </w:r>
     </w:p>
     <w:p>
@@ -687,24 +1060,109 @@
         <w:spacing w:line="269" w:lineRule="auto" w:before="120" w:after="0"/>
       </w:pPr>
       <w:r>
+        <w:t xml:space="preserve">A body paragraph between lists </w:t>
+      </w:r>
+      <w:r>
+        <w:rPr>
+          <w:rFonts w:ascii="Calibri" w:hAnsi="Calibri"/>
+          <w:b/>
+          <w:color w:val="1A1A1A"/>
+          <w:sz w:val="22"/>
+        </w:rPr>
+        <w:t>restarts numbering</w:t>
+      </w:r>
+      <w:r>
+        <w:t xml:space="preserve"> — useful when prose interrupts a sequence.</w:t>
+      </w:r>
+    </w:p>
+    <w:p>
+      <w:pPr>
+        <w:pStyle w:val="ListNumber"/>
+        <w:numPr>
+          <w:ilvl w:val="0"/>
+          <w:numId w:val="13"/>
+        </w:numPr>
+        <w:spacing w:before="80" w:after="0"/>
+      </w:pPr>
+      <w:r>
         <w:rPr>
           <w:rFonts w:ascii="Calibri" w:hAnsi="Calibri"/>
           <w:color w:val="1A1A1A"/>
           <w:sz w:val="22"/>
         </w:rPr>
-        <w:t>Markdown embedded images work like this:</w:t>
+        <w:t>This run starts at nine (markdown sets the seed value)</w:t>
+      </w:r>
+    </w:p>
+    <w:p>
+      <w:pPr>
+        <w:pStyle w:val="ListNumber"/>
+        <w:numPr>
+          <w:ilvl w:val="0"/>
+          <w:numId w:val="13"/>
+        </w:numPr>
+        <w:spacing w:before="60" w:after="0"/>
+      </w:pPr>
+      <w:r>
+        <w:rPr>
+          <w:rFonts w:ascii="Calibri" w:hAnsi="Calibri"/>
+          <w:color w:val="1A1A1A"/>
+          <w:sz w:val="22"/>
+        </w:rPr>
+        <w:t>and continues from there</w:t>
+      </w:r>
+    </w:p>
+    <w:p>
+      <w:bookmarkStart w:id="9" w:name="images-and-tables"/>
+      <w:pPr>
+        <w:pStyle w:val="Heading2"/>
+        <w:pBdr>
+          <w:bottom w:val="single" w:sz="6" w:space="2" w:color="2B579A"/>
+        </w:pBdr>
+        <w:spacing w:before="320" w:after="0"/>
+      </w:pPr>
+      <w:bookmarkEnd w:id="9"/>
+      <w:r>
+        <w:rPr>
+          <w:rFonts w:ascii="Calibri" w:hAnsi="Calibri"/>
+          <w:b/>
+          <w:color w:val="2B579A"/>
+          <w:sz w:val="32"/>
+        </w:rPr>
+        <w:t>Images and Tables</w:t>
       </w:r>
     </w:p>
     <w:p>
       <w:pPr>
         <w:pStyle w:val="Mark2wordBody"/>
-        <w:spacing w:before="80" w:after="0"/>
+        <w:spacing w:line="269" w:lineRule="auto" w:before="120" w:after="0"/>
+      </w:pPr>
+      <w:r>
+        <w:t>Images resolve relative to this file. Alt text can feed Word accessibility and/or a caption (</w:t>
+      </w:r>
+      <w:r>
+        <w:rPr>
+          <w:shd w:val="clear" w:color="auto" w:fill="F5F5F5"/>
+          <w:rFonts w:ascii="Consolas" w:hAnsi="Consolas"/>
+          <w:color w:val="1F497D"/>
+          <w:sz w:val="18"/>
+        </w:rPr>
+        <w:t>image.alt_mode</w:t>
+      </w:r>
+      <w:r>
+        <w:t xml:space="preserve"> in theme):</w:t>
+      </w:r>
+    </w:p>
+    <w:p>
+      <w:pPr>
+        <w:pStyle w:val="Mark2wordBody"/>
+        <w:spacing w:line="269" w:lineRule="auto" w:before="80" w:after="0"/>
+        <w:jc w:val="center"/>
       </w:pPr>
       <w:r>
         <w:drawing>
           <wp:inline xmlns:a="http://schemas.openxmlformats.org/drawingml/2006/main" xmlns:pic="http://schemas.openxmlformats.org/drawingml/2006/picture">
             <wp:extent cx="127000" cy="127000"/>
-            <wp:docPr id="1" name="Picture 1"/>
+            <wp:docPr id="1" name="Picture 1" descr="Accent swatch used in headings and table headers" title="Accent swatch used in headings and table headers"/>
             <wp:cNvGraphicFramePr>
               <a:graphicFrameLocks noChangeAspect="1"/>
             </wp:cNvGraphicFramePr>
@@ -712,11 +1170,11 @@
               <a:graphicData uri="http://schemas.openxmlformats.org/drawingml/2006/picture">
                 <pic:pic>
                   <pic:nvPicPr>
-                    <pic:cNvPr id="0" name="sample.png"/>
+                    <pic:cNvPr id="0" name="sample.png" descr="Accent swatch used in headings and table headers" title="Accent swatch used in headings and table headers"/>
                     <pic:cNvPicPr/>
                   </pic:nvPicPr>
                   <pic:blipFill>
-                    <a:blip r:embed="rId10"/>
+                    <a:blip r:embed="rId12"/>
                     <a:stretch>
                       <a:fillRect/>
                     </a:stretch>
@@ -735,38 +1193,6 @@
         </w:drawing>
       </w:r>
     </w:p>
-    <w:p>
-      <w:pPr>
-        <w:pStyle w:val="Heading2"/>
-        <w:pBdr>
-          <w:bottom w:val="single" w:sz="6" w:space="2" w:color="2B579A"/>
-        </w:pBdr>
-        <w:spacing w:before="320" w:after="0"/>
-      </w:pPr>
-      <w:r>
-        <w:rPr>
-          <w:rFonts w:ascii="Calibri" w:hAnsi="Calibri"/>
-          <w:b/>
-          <w:color w:val="2B579A"/>
-          <w:sz w:val="32"/>
-        </w:rPr>
-        <w:t>Tables</w:t>
-      </w:r>
-    </w:p>
-    <w:p>
-      <w:pPr>
-        <w:pStyle w:val="Mark2wordBody"/>
-        <w:spacing w:line="269" w:lineRule="auto" w:before="120" w:after="0"/>
-      </w:pPr>
-      <w:r>
-        <w:rPr>
-          <w:rFonts w:ascii="Calibri" w:hAnsi="Calibri"/>
-          <w:color w:val="1A1A1A"/>
-          <w:sz w:val="22"/>
-        </w:rPr>
-        <w:t>Styled elements reference table:</w:t>
-      </w:r>
-    </w:p>
     <w:tbl>
       <w:tblPr>
         <w:tblStyle w:val="TableGrid"/>
@@ -774,15 +1200,47 @@
         <w:tblLook w:firstColumn="1" w:firstRow="1" w:lastColumn="0" w:lastRow="0" w:noHBand="0" w:noVBand="1" w:val="04A0"/>
       </w:tblPr>
       <w:tblGrid>
-        <w:gridCol w:w="3360"/>
-        <w:gridCol w:w="3360"/>
-        <w:gridCol w:w="3360"/>
+        <w:gridCol w:w="3456"/>
+        <w:gridCol w:w="3456"/>
+        <w:gridCol w:w="3456"/>
       </w:tblGrid>
       <w:tr>
         <w:tc>
           <w:tcPr>
-            <w:tcW w:type="dxa" w:w="3360"/>
-            <w:shd w:val="clear" w:color="auto" w:fill="2B579A"/>
+            <w:tcW w:type="dxa" w:w="3456"/>
+            <w:shd w:val="clear" w:color="auto" w:fill="1F497D"/>
+            <w:tcMar>
+              <w:top w:w="120" w:type="dxa"/>
+              <w:bottom w:w="120" w:type="dxa"/>
+              <w:left w:w="160" w:type="dxa"/>
+              <w:right w:w="160" w:type="dxa"/>
+            </w:tcMar>
+          </w:tcPr>
+          <w:p>
+            <w:pPr>
+              <w:spacing w:before="80"/>
+            </w:pPr>
+            <w:r>
+              <w:rPr>
+                <w:rFonts w:ascii="Calibri" w:hAnsi="Calibri"/>
+                <w:b/>
+                <w:color w:val="FFFFFF"/>
+                <w:sz w:val="20"/>
+              </w:rPr>
+              <w:t>Feature</w:t>
+            </w:r>
+          </w:p>
+        </w:tc>
+        <w:tc>
+          <w:tcPr>
+            <w:tcW w:type="dxa" w:w="3456"/>
+            <w:shd w:val="clear" w:color="auto" w:fill="1F497D"/>
+            <w:tcMar>
+              <w:top w:w="120" w:type="dxa"/>
+              <w:bottom w:w="120" w:type="dxa"/>
+              <w:left w:w="160" w:type="dxa"/>
+              <w:right w:w="160" w:type="dxa"/>
+            </w:tcMar>
           </w:tcPr>
           <w:p>
             <w:r>
@@ -792,14 +1250,20 @@
                 <w:color w:val="FFFFFF"/>
                 <w:sz w:val="20"/>
               </w:rPr>
-              <w:t>Element</w:t>
+              <w:t>Markdown</w:t>
             </w:r>
           </w:p>
         </w:tc>
         <w:tc>
           <w:tcPr>
-            <w:tcW w:type="dxa" w:w="3360"/>
-            <w:shd w:val="clear" w:color="auto" w:fill="2B579A"/>
+            <w:tcW w:type="dxa" w:w="3456"/>
+            <w:shd w:val="clear" w:color="auto" w:fill="1F497D"/>
+            <w:tcMar>
+              <w:top w:w="120" w:type="dxa"/>
+              <w:bottom w:w="120" w:type="dxa"/>
+              <w:left w:w="160" w:type="dxa"/>
+              <w:right w:w="160" w:type="dxa"/>
+            </w:tcMar>
           </w:tcPr>
           <w:p>
             <w:r>
@@ -809,24 +1273,7 @@
                 <w:color w:val="FFFFFF"/>
                 <w:sz w:val="20"/>
               </w:rPr>
-              <w:t>What you write</w:t>
-            </w:r>
-          </w:p>
-        </w:tc>
-        <w:tc>
-          <w:tcPr>
-            <w:tcW w:type="dxa" w:w="3360"/>
-            <w:shd w:val="clear" w:color="auto" w:fill="2B579A"/>
-          </w:tcPr>
-          <w:p>
-            <w:r>
-              <w:rPr>
-                <w:rFonts w:ascii="Calibri" w:hAnsi="Calibri"/>
-                <w:b/>
-                <w:color w:val="FFFFFF"/>
-                <w:sz w:val="20"/>
-              </w:rPr>
-              <w:t>What the theme controls</w:t>
+              <w:t>Theme keys</w:t>
             </w:r>
           </w:p>
         </w:tc>
@@ -834,14 +1281,118 @@
       <w:tr>
         <w:tc>
           <w:tcPr>
-            <w:tcW w:type="dxa" w:w="3360"/>
+            <w:tcW w:type="dxa" w:w="3456"/>
+            <w:tcMar>
+              <w:top w:w="80" w:type="dxa"/>
+              <w:bottom w:w="80" w:type="dxa"/>
+              <w:left w:w="160" w:type="dxa"/>
+              <w:right w:w="160" w:type="dxa"/>
+            </w:tcMar>
           </w:tcPr>
           <w:p>
             <w:r>
               <w:rPr>
                 <w:rFonts w:ascii="Calibri" w:hAnsi="Calibri"/>
                 <w:color w:val="1A1A1A"/>
-                <w:sz w:val="20"/>
+                <w:sz w:val="18"/>
+              </w:rPr>
+              <w:t>Page chrome</w:t>
+            </w:r>
+          </w:p>
+        </w:tc>
+        <w:tc>
+          <w:tcPr>
+            <w:tcW w:type="dxa" w:w="3456"/>
+            <w:tcMar>
+              <w:top w:w="80" w:type="dxa"/>
+              <w:bottom w:w="80" w:type="dxa"/>
+              <w:left w:w="160" w:type="dxa"/>
+              <w:right w:w="160" w:type="dxa"/>
+            </w:tcMar>
+          </w:tcPr>
+          <w:p>
+            <w:r>
+              <w:rPr>
+                <w:rFonts w:ascii="Calibri" w:hAnsi="Calibri"/>
+                <w:i/>
+                <w:color w:val="1A1A1A"/>
+                <w:sz w:val="18"/>
+              </w:rPr>
+              <w:t>(none — theme only)</w:t>
+            </w:r>
+          </w:p>
+        </w:tc>
+        <w:tc>
+          <w:tcPr>
+            <w:tcW w:type="dxa" w:w="3456"/>
+            <w:tcMar>
+              <w:top w:w="80" w:type="dxa"/>
+              <w:bottom w:w="80" w:type="dxa"/>
+              <w:left w:w="160" w:type="dxa"/>
+              <w:right w:w="160" w:type="dxa"/>
+            </w:tcMar>
+          </w:tcPr>
+          <w:p>
+            <w:r>
+              <w:rPr>
+                <w:rFonts w:ascii="Calibri" w:hAnsi="Calibri"/>
+                <w:color w:val="1A1A1A"/>
+                <w:sz w:val="18"/>
+              </w:rPr>
+              <w:t>page.header</w:t>
+            </w:r>
+            <w:r>
+              <w:rPr>
+                <w:rFonts w:ascii="Calibri" w:hAnsi="Calibri"/>
+                <w:color w:val="1A1A1A"/>
+                <w:sz w:val="18"/>
+              </w:rPr>
+              <w:t xml:space="preserve">, </w:t>
+            </w:r>
+            <w:r>
+              <w:rPr>
+                <w:rFonts w:ascii="Calibri" w:hAnsi="Calibri"/>
+                <w:color w:val="1A1A1A"/>
+                <w:sz w:val="18"/>
+              </w:rPr>
+              <w:t>page.footer</w:t>
+            </w:r>
+            <w:r>
+              <w:rPr>
+                <w:rFonts w:ascii="Calibri" w:hAnsi="Calibri"/>
+                <w:color w:val="1A1A1A"/>
+                <w:sz w:val="18"/>
+              </w:rPr>
+              <w:t xml:space="preserve">, </w:t>
+            </w:r>
+            <w:r>
+              <w:rPr>
+                <w:rFonts w:ascii="Calibri" w:hAnsi="Calibri"/>
+                <w:color w:val="1A1A1A"/>
+                <w:sz w:val="18"/>
+              </w:rPr>
+              <w:t>{title}</w:t>
+            </w:r>
+          </w:p>
+        </w:tc>
+      </w:tr>
+      <w:tr>
+        <w:tc>
+          <w:tcPr>
+            <w:tcW w:type="dxa" w:w="3456"/>
+            <w:tcMar>
+              <w:top w:w="80" w:type="dxa"/>
+              <w:bottom w:w="80" w:type="dxa"/>
+              <w:left w:w="160" w:type="dxa"/>
+              <w:right w:w="160" w:type="dxa"/>
+            </w:tcMar>
+          </w:tcPr>
+          <w:p>
+            <w:r>
+              <w:rPr>
+                <w:rFonts w:ascii="Calibri" w:hAnsi="Calibri"/>
+                <w:color w:val="1A1A1A"/>
+                <w:sz w:val="18"/>
               </w:rPr>
               <w:t>Headings</w:t>
             </w:r>
@@ -849,14 +1400,20 @@
         </w:tc>
         <w:tc>
           <w:tcPr>
-            <w:tcW w:type="dxa" w:w="3360"/>
+            <w:tcW w:type="dxa" w:w="3456"/>
+            <w:tcMar>
+              <w:top w:w="80" w:type="dxa"/>
+              <w:bottom w:w="80" w:type="dxa"/>
+              <w:left w:w="160" w:type="dxa"/>
+              <w:right w:w="160" w:type="dxa"/>
+            </w:tcMar>
           </w:tcPr>
           <w:p>
             <w:r>
               <w:rPr>
                 <w:rFonts w:ascii="Calibri" w:hAnsi="Calibri"/>
                 <w:color w:val="1A1A1A"/>
-                <w:sz w:val="20"/>
+                <w:sz w:val="18"/>
               </w:rPr>
               <w:t>#</w:t>
             </w:r>
@@ -864,15 +1421,15 @@
               <w:rPr>
                 <w:rFonts w:ascii="Calibri" w:hAnsi="Calibri"/>
                 <w:color w:val="1A1A1A"/>
-                <w:sz w:val="20"/>
+                <w:sz w:val="18"/>
               </w:rPr>
-              <w:t xml:space="preserve"> through </w:t>
+              <w:t xml:space="preserve"> … </w:t>
             </w:r>
             <w:r>
               <w:rPr>
                 <w:rFonts w:ascii="Calibri" w:hAnsi="Calibri"/>
                 <w:color w:val="1A1A1A"/>
-                <w:sz w:val="20"/>
+                <w:sz w:val="18"/>
               </w:rPr>
               <w:t>######</w:t>
             </w:r>
@@ -880,14 +1437,20 @@
         </w:tc>
         <w:tc>
           <w:tcPr>
-            <w:tcW w:type="dxa" w:w="3360"/>
+            <w:tcW w:type="dxa" w:w="3456"/>
+            <w:tcMar>
+              <w:top w:w="80" w:type="dxa"/>
+              <w:bottom w:w="80" w:type="dxa"/>
+              <w:left w:w="160" w:type="dxa"/>
+              <w:right w:w="160" w:type="dxa"/>
+            </w:tcMar>
           </w:tcPr>
           <w:p>
             <w:r>
               <w:rPr>
                 <w:rFonts w:ascii="Calibri" w:hAnsi="Calibri"/>
                 <w:color w:val="1A1A1A"/>
-                <w:sz w:val="20"/>
+                <w:sz w:val="18"/>
               </w:rPr>
               <w:t>heading</w:t>
             </w:r>
@@ -895,7 +1458,7 @@
               <w:rPr>
                 <w:rFonts w:ascii="Calibri" w:hAnsi="Calibri"/>
                 <w:color w:val="1A1A1A"/>
-                <w:sz w:val="20"/>
+                <w:sz w:val="18"/>
               </w:rPr>
               <w:t xml:space="preserve">, </w:t>
             </w:r>
@@ -903,7 +1466,7 @@
               <w:rPr>
                 <w:rFonts w:ascii="Calibri" w:hAnsi="Calibri"/>
                 <w:color w:val="1A1A1A"/>
-                <w:sz w:val="20"/>
+                <w:sz w:val="18"/>
               </w:rPr>
               <w:t>h1</w:t>
             </w:r>
@@ -911,7 +1474,7 @@
               <w:rPr>
                 <w:rFonts w:ascii="Calibri" w:hAnsi="Calibri"/>
                 <w:color w:val="1A1A1A"/>
-                <w:sz w:val="20"/>
+                <w:sz w:val="18"/>
               </w:rPr>
               <w:t>–</w:t>
             </w:r>
@@ -919,7 +1482,7 @@
               <w:rPr>
                 <w:rFonts w:ascii="Calibri" w:hAnsi="Calibri"/>
                 <w:color w:val="1A1A1A"/>
-                <w:sz w:val="20"/>
+                <w:sz w:val="18"/>
               </w:rPr>
               <w:t>h6</w:t>
             </w:r>
@@ -927,9 +1490,17 @@
               <w:rPr>
                 <w:rFonts w:ascii="Calibri" w:hAnsi="Calibri"/>
                 <w:color w:val="1A1A1A"/>
-                <w:sz w:val="20"/>
+                <w:sz w:val="18"/>
               </w:rPr>
-              <w:t>, fonts, color, borders</w:t>
+              <w:t xml:space="preserve">, bookmarks for </w:t>
+            </w:r>
+            <w:r>
+              <w:rPr>
+                <w:rFonts w:ascii="Calibri" w:hAnsi="Calibri"/>
+                <w:color w:val="1A1A1A"/>
+                <w:sz w:val="18"/>
+              </w:rPr>
+              <w:t>#links</w:t>
             </w:r>
           </w:p>
         </w:tc>
@@ -937,52 +1508,70 @@
       <w:tr>
         <w:tc>
           <w:tcPr>
-            <w:tcW w:type="dxa" w:w="3360"/>
+            <w:tcW w:type="dxa" w:w="3456"/>
+            <w:tcMar>
+              <w:top w:w="80" w:type="dxa"/>
+              <w:bottom w:w="80" w:type="dxa"/>
+              <w:left w:w="160" w:type="dxa"/>
+              <w:right w:w="160" w:type="dxa"/>
+            </w:tcMar>
           </w:tcPr>
           <w:p>
             <w:r>
               <w:rPr>
                 <w:rFonts w:ascii="Calibri" w:hAnsi="Calibri"/>
                 <w:color w:val="1A1A1A"/>
-                <w:sz w:val="20"/>
+                <w:sz w:val="18"/>
               </w:rPr>
-              <w:t>Body</w:t>
+              <w:t>Blockquote</w:t>
             </w:r>
           </w:p>
         </w:tc>
         <w:tc>
           <w:tcPr>
-            <w:tcW w:type="dxa" w:w="3360"/>
+            <w:tcW w:type="dxa" w:w="3456"/>
+            <w:tcMar>
+              <w:top w:w="80" w:type="dxa"/>
+              <w:bottom w:w="80" w:type="dxa"/>
+              <w:left w:w="160" w:type="dxa"/>
+              <w:right w:w="160" w:type="dxa"/>
+            </w:tcMar>
           </w:tcPr>
           <w:p>
             <w:r>
               <w:rPr>
                 <w:rFonts w:ascii="Calibri" w:hAnsi="Calibri"/>
                 <w:color w:val="1A1A1A"/>
-                <w:sz w:val="20"/>
+                <w:sz w:val="18"/>
               </w:rPr>
-              <w:t>plain lines</w:t>
+              <w:t>&gt; quote</w:t>
             </w:r>
           </w:p>
         </w:tc>
         <w:tc>
           <w:tcPr>
-            <w:tcW w:type="dxa" w:w="3360"/>
+            <w:tcW w:type="dxa" w:w="3456"/>
+            <w:tcMar>
+              <w:top w:w="80" w:type="dxa"/>
+              <w:bottom w:w="80" w:type="dxa"/>
+              <w:left w:w="160" w:type="dxa"/>
+              <w:right w:w="160" w:type="dxa"/>
+            </w:tcMar>
           </w:tcPr>
           <w:p>
             <w:r>
               <w:rPr>
                 <w:rFonts w:ascii="Calibri" w:hAnsi="Calibri"/>
                 <w:color w:val="1A1A1A"/>
-                <w:sz w:val="20"/>
+                <w:sz w:val="18"/>
               </w:rPr>
-              <w:t>body</w:t>
+              <w:t>blockquote</w:t>
             </w:r>
             <w:r>
               <w:rPr>
                 <w:rFonts w:ascii="Calibri" w:hAnsi="Calibri"/>
                 <w:color w:val="1A1A1A"/>
-                <w:sz w:val="20"/>
+                <w:sz w:val="18"/>
               </w:rPr>
               <w:t xml:space="preserve">, </w:t>
             </w:r>
@@ -990,17 +1579,25 @@
               <w:rPr>
                 <w:rFonts w:ascii="Calibri" w:hAnsi="Calibri"/>
                 <w:color w:val="1A1A1A"/>
-                <w:sz w:val="20"/>
+                <w:sz w:val="18"/>
               </w:rPr>
-              <w:t>text</w:t>
+              <w:t>indent_left</w:t>
             </w:r>
             <w:r>
               <w:rPr>
                 <w:rFonts w:ascii="Calibri" w:hAnsi="Calibri"/>
                 <w:color w:val="1A1A1A"/>
-                <w:sz w:val="20"/>
+                <w:sz w:val="18"/>
               </w:rPr>
-              <w:t>, spacing, alignment</w:t>
+              <w:t xml:space="preserve"> / </w:t>
+            </w:r>
+            <w:r>
+              <w:rPr>
+                <w:rFonts w:ascii="Calibri" w:hAnsi="Calibri"/>
+                <w:color w:val="1A1A1A"/>
+                <w:sz w:val="18"/>
+              </w:rPr>
+              <w:t>indent_right</w:t>
             </w:r>
           </w:p>
         </w:tc>
@@ -1008,14 +1605,175 @@
       <w:tr>
         <w:tc>
           <w:tcPr>
-            <w:tcW w:type="dxa" w:w="3360"/>
+            <w:tcW w:type="dxa" w:w="3456"/>
+            <w:tcMar>
+              <w:top w:w="80" w:type="dxa"/>
+              <w:bottom w:w="80" w:type="dxa"/>
+              <w:left w:w="160" w:type="dxa"/>
+              <w:right w:w="160" w:type="dxa"/>
+            </w:tcMar>
           </w:tcPr>
           <w:p>
             <w:r>
               <w:rPr>
                 <w:rFonts w:ascii="Calibri" w:hAnsi="Calibri"/>
                 <w:color w:val="1A1A1A"/>
-                <w:sz w:val="20"/>
+                <w:sz w:val="18"/>
+              </w:rPr>
+              <w:t>Horizontal rule</w:t>
+            </w:r>
+          </w:p>
+        </w:tc>
+        <w:tc>
+          <w:tcPr>
+            <w:tcW w:type="dxa" w:w="3456"/>
+            <w:tcMar>
+              <w:top w:w="80" w:type="dxa"/>
+              <w:bottom w:w="80" w:type="dxa"/>
+              <w:left w:w="160" w:type="dxa"/>
+              <w:right w:w="160" w:type="dxa"/>
+            </w:tcMar>
+          </w:tcPr>
+          <w:p>
+            <w:r>
+              <w:rPr>
+                <w:rFonts w:ascii="Calibri" w:hAnsi="Calibri"/>
+                <w:color w:val="1A1A1A"/>
+                <w:sz w:val="18"/>
+              </w:rPr>
+              <w:t>---</w:t>
+            </w:r>
+            <w:r>
+              <w:rPr>
+                <w:rFonts w:ascii="Calibri" w:hAnsi="Calibri"/>
+                <w:color w:val="1A1A1A"/>
+                <w:sz w:val="18"/>
+              </w:rPr>
+              <w:t xml:space="preserve"> on its own line</w:t>
+            </w:r>
+          </w:p>
+        </w:tc>
+        <w:tc>
+          <w:tcPr>
+            <w:tcW w:type="dxa" w:w="3456"/>
+            <w:tcMar>
+              <w:top w:w="80" w:type="dxa"/>
+              <w:bottom w:w="80" w:type="dxa"/>
+              <w:left w:w="160" w:type="dxa"/>
+              <w:right w:w="160" w:type="dxa"/>
+            </w:tcMar>
+          </w:tcPr>
+          <w:p>
+            <w:r>
+              <w:rPr>
+                <w:rFonts w:ascii="Calibri" w:hAnsi="Calibri"/>
+                <w:color w:val="1A1A1A"/>
+                <w:sz w:val="18"/>
+              </w:rPr>
+              <w:t>hr</w:t>
+            </w:r>
+            <w:r>
+              <w:rPr>
+                <w:rFonts w:ascii="Calibri" w:hAnsi="Calibri"/>
+                <w:color w:val="1A1A1A"/>
+                <w:sz w:val="18"/>
+              </w:rPr>
+              <w:t xml:space="preserve">, </w:t>
+            </w:r>
+            <w:r>
+              <w:rPr>
+                <w:rFonts w:ascii="Calibri" w:hAnsi="Calibri"/>
+                <w:color w:val="1A1A1A"/>
+                <w:sz w:val="18"/>
+              </w:rPr>
+              <w:t>border_bottom</w:t>
+            </w:r>
+          </w:p>
+        </w:tc>
+      </w:tr>
+      <w:tr>
+        <w:tc>
+          <w:tcPr>
+            <w:tcW w:type="dxa" w:w="3456"/>
+            <w:tcMar>
+              <w:top w:w="80" w:type="dxa"/>
+              <w:bottom w:w="80" w:type="dxa"/>
+              <w:left w:w="160" w:type="dxa"/>
+              <w:right w:w="160" w:type="dxa"/>
+            </w:tcMar>
+          </w:tcPr>
+          <w:p>
+            <w:r>
+              <w:rPr>
+                <w:rFonts w:ascii="Calibri" w:hAnsi="Calibri"/>
+                <w:color w:val="1A1A1A"/>
+                <w:sz w:val="18"/>
+              </w:rPr>
+              <w:t>Page break</w:t>
+            </w:r>
+          </w:p>
+        </w:tc>
+        <w:tc>
+          <w:tcPr>
+            <w:tcW w:type="dxa" w:w="3456"/>
+            <w:tcMar>
+              <w:top w:w="80" w:type="dxa"/>
+              <w:bottom w:w="80" w:type="dxa"/>
+              <w:left w:w="160" w:type="dxa"/>
+              <w:right w:w="160" w:type="dxa"/>
+            </w:tcMar>
+          </w:tcPr>
+          <w:p>
+            <w:r>
+              <w:rPr>
+                <w:rFonts w:ascii="Calibri" w:hAnsi="Calibri"/>
+                <w:color w:val="1A1A1A"/>
+                <w:sz w:val="18"/>
+              </w:rPr>
+              <w:t>&lt;!-- pagebreak --&gt;</w:t>
+            </w:r>
+          </w:p>
+        </w:tc>
+        <w:tc>
+          <w:tcPr>
+            <w:tcW w:type="dxa" w:w="3456"/>
+            <w:tcMar>
+              <w:top w:w="80" w:type="dxa"/>
+              <w:bottom w:w="80" w:type="dxa"/>
+              <w:left w:w="160" w:type="dxa"/>
+              <w:right w:w="160" w:type="dxa"/>
+            </w:tcMar>
+          </w:tcPr>
+          <w:p>
+            <w:r>
+              <w:rPr>
+                <w:rFonts w:ascii="Calibri" w:hAnsi="Calibri"/>
+                <w:i/>
+                <w:color w:val="1A1A1A"/>
+                <w:sz w:val="18"/>
+              </w:rPr>
+              <w:t>(invisible in MD preview)</w:t>
+            </w:r>
+          </w:p>
+        </w:tc>
+      </w:tr>
+      <w:tr>
+        <w:tc>
+          <w:tcPr>
+            <w:tcW w:type="dxa" w:w="3456"/>
+            <w:tcMar>
+              <w:top w:w="80" w:type="dxa"/>
+              <w:bottom w:w="80" w:type="dxa"/>
+              <w:left w:w="160" w:type="dxa"/>
+              <w:right w:w="160" w:type="dxa"/>
+            </w:tcMar>
+          </w:tcPr>
+          <w:p>
+            <w:r>
+              <w:rPr>
+                <w:rFonts w:ascii="Calibri" w:hAnsi="Calibri"/>
+                <w:color w:val="1A1A1A"/>
+                <w:sz w:val="18"/>
               </w:rPr>
               <w:t>Lists</w:t>
             </w:r>
@@ -1023,22 +1781,28 @@
         </w:tc>
         <w:tc>
           <w:tcPr>
-            <w:tcW w:type="dxa" w:w="3360"/>
+            <w:tcW w:type="dxa" w:w="3456"/>
+            <w:tcMar>
+              <w:top w:w="80" w:type="dxa"/>
+              <w:bottom w:w="80" w:type="dxa"/>
+              <w:left w:w="160" w:type="dxa"/>
+              <w:right w:w="160" w:type="dxa"/>
+            </w:tcMar>
           </w:tcPr>
           <w:p>
             <w:r>
               <w:rPr>
                 <w:rFonts w:ascii="Calibri" w:hAnsi="Calibri"/>
                 <w:color w:val="1A1A1A"/>
-                <w:sz w:val="20"/>
+                <w:sz w:val="18"/>
               </w:rPr>
-              <w:t>- item</w:t>
+              <w:t>-</w:t>
             </w:r>
             <w:r>
               <w:rPr>
                 <w:rFonts w:ascii="Calibri" w:hAnsi="Calibri"/>
                 <w:color w:val="1A1A1A"/>
-                <w:sz w:val="20"/>
+                <w:sz w:val="18"/>
               </w:rPr>
               <w:t xml:space="preserve"> / </w:t>
             </w:r>
@@ -1046,22 +1810,28 @@
               <w:rPr>
                 <w:rFonts w:ascii="Calibri" w:hAnsi="Calibri"/>
                 <w:color w:val="1A1A1A"/>
-                <w:sz w:val="20"/>
+                <w:sz w:val="18"/>
               </w:rPr>
-              <w:t>1. item</w:t>
+              <w:t>1.</w:t>
             </w:r>
           </w:p>
         </w:tc>
         <w:tc>
           <w:tcPr>
-            <w:tcW w:type="dxa" w:w="3360"/>
+            <w:tcW w:type="dxa" w:w="3456"/>
+            <w:tcMar>
+              <w:top w:w="80" w:type="dxa"/>
+              <w:bottom w:w="80" w:type="dxa"/>
+              <w:left w:w="160" w:type="dxa"/>
+              <w:right w:w="160" w:type="dxa"/>
+            </w:tcMar>
           </w:tcPr>
           <w:p>
             <w:r>
               <w:rPr>
                 <w:rFonts w:ascii="Calibri" w:hAnsi="Calibri"/>
                 <w:color w:val="1A1A1A"/>
-                <w:sz w:val="20"/>
+                <w:sz w:val="18"/>
               </w:rPr>
               <w:t>list</w:t>
             </w:r>
@@ -1069,17 +1839,49 @@
               <w:rPr>
                 <w:rFonts w:ascii="Calibri" w:hAnsi="Calibri"/>
                 <w:color w:val="1A1A1A"/>
-                <w:sz w:val="20"/>
+                <w:sz w:val="18"/>
               </w:rPr>
-              <w:t xml:space="preserve">, indents, </w:t>
+              <w:t xml:space="preserve">, </w:t>
             </w:r>
             <w:r>
               <w:rPr>
                 <w:rFonts w:ascii="Calibri" w:hAnsi="Calibri"/>
                 <w:color w:val="1A1A1A"/>
-                <w:sz w:val="20"/>
+                <w:sz w:val="18"/>
               </w:rPr>
-              <w:t>space_between</w:t>
+              <w:t>ol</w:t>
+            </w:r>
+            <w:r>
+              <w:rPr>
+                <w:rFonts w:ascii="Calibri" w:hAnsi="Calibri"/>
+                <w:color w:val="1A1A1A"/>
+                <w:sz w:val="18"/>
+              </w:rPr>
+              <w:t xml:space="preserve">, </w:t>
+            </w:r>
+            <w:r>
+              <w:rPr>
+                <w:rFonts w:ascii="Calibri" w:hAnsi="Calibri"/>
+                <w:color w:val="1A1A1A"/>
+                <w:sz w:val="18"/>
+              </w:rPr>
+              <w:t>ul</w:t>
+            </w:r>
+            <w:r>
+              <w:rPr>
+                <w:rFonts w:ascii="Calibri" w:hAnsi="Calibri"/>
+                <w:color w:val="1A1A1A"/>
+                <w:sz w:val="18"/>
+              </w:rPr>
+              <w:t xml:space="preserve">, </w:t>
+            </w:r>
+            <w:r>
+              <w:rPr>
+                <w:rFonts w:ascii="Calibri" w:hAnsi="Calibri"/>
+                <w:color w:val="1A1A1A"/>
+                <w:sz w:val="18"/>
+              </w:rPr>
+              <w:t>levels</w:t>
             </w:r>
           </w:p>
         </w:tc>
@@ -1087,14 +1889,20 @@
       <w:tr>
         <w:tc>
           <w:tcPr>
-            <w:tcW w:type="dxa" w:w="3360"/>
+            <w:tcW w:type="dxa" w:w="3456"/>
+            <w:tcMar>
+              <w:top w:w="80" w:type="dxa"/>
+              <w:bottom w:w="80" w:type="dxa"/>
+              <w:left w:w="160" w:type="dxa"/>
+              <w:right w:w="160" w:type="dxa"/>
+            </w:tcMar>
           </w:tcPr>
           <w:p>
             <w:r>
               <w:rPr>
                 <w:rFonts w:ascii="Calibri" w:hAnsi="Calibri"/>
                 <w:color w:val="1A1A1A"/>
-                <w:sz w:val="20"/>
+                <w:sz w:val="18"/>
               </w:rPr>
               <w:t>Regions</w:t>
             </w:r>
@@ -1102,14 +1910,20 @@
         </w:tc>
         <w:tc>
           <w:tcPr>
-            <w:tcW w:type="dxa" w:w="3360"/>
+            <w:tcW w:type="dxa" w:w="3456"/>
+            <w:tcMar>
+              <w:top w:w="80" w:type="dxa"/>
+              <w:bottom w:w="80" w:type="dxa"/>
+              <w:left w:w="160" w:type="dxa"/>
+              <w:right w:w="160" w:type="dxa"/>
+            </w:tcMar>
           </w:tcPr>
           <w:p>
             <w:r>
               <w:rPr>
                 <w:rFonts w:ascii="Calibri" w:hAnsi="Calibri"/>
                 <w:color w:val="1A1A1A"/>
-                <w:sz w:val="20"/>
+                <w:sz w:val="18"/>
               </w:rPr>
               <w:t>&lt;!-- region: name --&gt;</w:t>
             </w:r>
@@ -1117,14 +1931,20 @@
         </w:tc>
         <w:tc>
           <w:tcPr>
-            <w:tcW w:type="dxa" w:w="3360"/>
+            <w:tcW w:type="dxa" w:w="3456"/>
+            <w:tcMar>
+              <w:top w:w="80" w:type="dxa"/>
+              <w:bottom w:w="80" w:type="dxa"/>
+              <w:left w:w="160" w:type="dxa"/>
+              <w:right w:w="160" w:type="dxa"/>
+            </w:tcMar>
           </w:tcPr>
           <w:p>
             <w:r>
               <w:rPr>
                 <w:rFonts w:ascii="Calibri" w:hAnsi="Calibri"/>
                 <w:color w:val="1A1A1A"/>
-                <w:sz w:val="20"/>
+                <w:sz w:val="18"/>
               </w:rPr>
               <w:t>$name</w:t>
             </w:r>
@@ -1132,9 +1952,9 @@
               <w:rPr>
                 <w:rFonts w:ascii="Calibri" w:hAnsi="Calibri"/>
                 <w:color w:val="1A1A1A"/>
-                <w:sz w:val="20"/>
+                <w:sz w:val="18"/>
               </w:rPr>
-              <w:t xml:space="preserve"> blocks with nested targets</w:t>
+              <w:t xml:space="preserve"> nested blocks</w:t>
             </w:r>
           </w:p>
         </w:tc>
@@ -1142,14 +1962,20 @@
       <w:tr>
         <w:tc>
           <w:tcPr>
-            <w:tcW w:type="dxa" w:w="3360"/>
+            <w:tcW w:type="dxa" w:w="3456"/>
+            <w:tcMar>
+              <w:top w:w="80" w:type="dxa"/>
+              <w:bottom w:w="80" w:type="dxa"/>
+              <w:left w:w="160" w:type="dxa"/>
+              <w:right w:w="160" w:type="dxa"/>
+            </w:tcMar>
           </w:tcPr>
           <w:p>
             <w:r>
               <w:rPr>
                 <w:rFonts w:ascii="Calibri" w:hAnsi="Calibri"/>
                 <w:color w:val="1A1A1A"/>
-                <w:sz w:val="20"/>
+                <w:sz w:val="18"/>
               </w:rPr>
               <w:t>Tables</w:t>
             </w:r>
@@ -1157,29 +1983,41 @@
         </w:tc>
         <w:tc>
           <w:tcPr>
-            <w:tcW w:type="dxa" w:w="3360"/>
+            <w:tcW w:type="dxa" w:w="3456"/>
+            <w:tcMar>
+              <w:top w:w="80" w:type="dxa"/>
+              <w:bottom w:w="80" w:type="dxa"/>
+              <w:left w:w="160" w:type="dxa"/>
+              <w:right w:w="160" w:type="dxa"/>
+            </w:tcMar>
           </w:tcPr>
           <w:p>
             <w:r>
               <w:rPr>
                 <w:rFonts w:ascii="Calibri" w:hAnsi="Calibri"/>
                 <w:color w:val="1A1A1A"/>
-                <w:sz w:val="20"/>
+                <w:sz w:val="18"/>
               </w:rPr>
-              <w:t>pipe tables</w:t>
+              <w:t>pipe syntax</w:t>
             </w:r>
           </w:p>
         </w:tc>
         <w:tc>
           <w:tcPr>
-            <w:tcW w:type="dxa" w:w="3360"/>
+            <w:tcW w:type="dxa" w:w="3456"/>
+            <w:tcMar>
+              <w:top w:w="80" w:type="dxa"/>
+              <w:bottom w:w="80" w:type="dxa"/>
+              <w:left w:w="160" w:type="dxa"/>
+              <w:right w:w="160" w:type="dxa"/>
+            </w:tcMar>
           </w:tcPr>
           <w:p>
             <w:r>
               <w:rPr>
                 <w:rFonts w:ascii="Calibri" w:hAnsi="Calibri"/>
                 <w:color w:val="1A1A1A"/>
-                <w:sz w:val="20"/>
+                <w:sz w:val="18"/>
               </w:rPr>
               <w:t>table</w:t>
             </w:r>
@@ -1187,7 +2025,7 @@
               <w:rPr>
                 <w:rFonts w:ascii="Calibri" w:hAnsi="Calibri"/>
                 <w:color w:val="1A1A1A"/>
-                <w:sz w:val="20"/>
+                <w:sz w:val="18"/>
               </w:rPr>
               <w:t xml:space="preserve">, </w:t>
             </w:r>
@@ -1195,7 +2033,7 @@
               <w:rPr>
                 <w:rFonts w:ascii="Calibri" w:hAnsi="Calibri"/>
                 <w:color w:val="1A1A1A"/>
-                <w:sz w:val="20"/>
+                <w:sz w:val="18"/>
               </w:rPr>
               <w:t>th</w:t>
             </w:r>
@@ -1203,7 +2041,7 @@
               <w:rPr>
                 <w:rFonts w:ascii="Calibri" w:hAnsi="Calibri"/>
                 <w:color w:val="1A1A1A"/>
-                <w:sz w:val="20"/>
+                <w:sz w:val="18"/>
               </w:rPr>
               <w:t xml:space="preserve">, </w:t>
             </w:r>
@@ -1211,7 +2049,7 @@
               <w:rPr>
                 <w:rFonts w:ascii="Calibri" w:hAnsi="Calibri"/>
                 <w:color w:val="1A1A1A"/>
-                <w:sz w:val="20"/>
+                <w:sz w:val="18"/>
               </w:rPr>
               <w:t>td</w:t>
             </w:r>
@@ -1219,7 +2057,7 @@
               <w:rPr>
                 <w:rFonts w:ascii="Calibri" w:hAnsi="Calibri"/>
                 <w:color w:val="1A1A1A"/>
-                <w:sz w:val="20"/>
+                <w:sz w:val="18"/>
               </w:rPr>
               <w:t xml:space="preserve">, </w:t>
             </w:r>
@@ -1227,9 +2065,25 @@
               <w:rPr>
                 <w:rFonts w:ascii="Calibri" w:hAnsi="Calibri"/>
                 <w:color w:val="1A1A1A"/>
-                <w:sz w:val="20"/>
+                <w:sz w:val="18"/>
               </w:rPr>
-              <w:t>fill</w:t>
+              <w:t>border</w:t>
+            </w:r>
+            <w:r>
+              <w:rPr>
+                <w:rFonts w:ascii="Calibri" w:hAnsi="Calibri"/>
+                <w:color w:val="1A1A1A"/>
+                <w:sz w:val="18"/>
+              </w:rPr>
+              <w:t xml:space="preserve">, </w:t>
+            </w:r>
+            <w:r>
+              <w:rPr>
+                <w:rFonts w:ascii="Calibri" w:hAnsi="Calibri"/>
+                <w:color w:val="1A1A1A"/>
+                <w:sz w:val="18"/>
+              </w:rPr>
+              <w:t>padding</w:t>
             </w:r>
           </w:p>
         </w:tc>
@@ -1237,14 +2091,20 @@
       <w:tr>
         <w:tc>
           <w:tcPr>
-            <w:tcW w:type="dxa" w:w="3360"/>
+            <w:tcW w:type="dxa" w:w="3456"/>
+            <w:tcMar>
+              <w:top w:w="80" w:type="dxa"/>
+              <w:bottom w:w="80" w:type="dxa"/>
+              <w:left w:w="160" w:type="dxa"/>
+              <w:right w:w="160" w:type="dxa"/>
+            </w:tcMar>
           </w:tcPr>
           <w:p>
             <w:r>
               <w:rPr>
                 <w:rFonts w:ascii="Calibri" w:hAnsi="Calibri"/>
                 <w:color w:val="1A1A1A"/>
-                <w:sz w:val="20"/>
+                <w:sz w:val="18"/>
               </w:rPr>
               <w:t>Code</w:t>
             </w:r>
@@ -1252,14 +2112,20 @@
         </w:tc>
         <w:tc>
           <w:tcPr>
-            <w:tcW w:type="dxa" w:w="3360"/>
+            <w:tcW w:type="dxa" w:w="3456"/>
+            <w:tcMar>
+              <w:top w:w="80" w:type="dxa"/>
+              <w:bottom w:w="80" w:type="dxa"/>
+              <w:left w:w="160" w:type="dxa"/>
+              <w:right w:w="160" w:type="dxa"/>
+            </w:tcMar>
           </w:tcPr>
           <w:p>
             <w:r>
               <w:rPr>
                 <w:rFonts w:ascii="Calibri" w:hAnsi="Calibri"/>
                 <w:color w:val="1A1A1A"/>
-                <w:sz w:val="20"/>
+                <w:sz w:val="18"/>
               </w:rPr>
               <w:t>fenced blocks</w:t>
             </w:r>
@@ -1267,14 +2133,20 @@
         </w:tc>
         <w:tc>
           <w:tcPr>
-            <w:tcW w:type="dxa" w:w="3360"/>
+            <w:tcW w:type="dxa" w:w="3456"/>
+            <w:tcMar>
+              <w:top w:w="80" w:type="dxa"/>
+              <w:bottom w:w="80" w:type="dxa"/>
+              <w:left w:w="160" w:type="dxa"/>
+              <w:right w:w="160" w:type="dxa"/>
+            </w:tcMar>
           </w:tcPr>
           <w:p>
             <w:r>
               <w:rPr>
                 <w:rFonts w:ascii="Calibri" w:hAnsi="Calibri"/>
                 <w:color w:val="1A1A1A"/>
-                <w:sz w:val="20"/>
+                <w:sz w:val="18"/>
               </w:rPr>
               <w:t>code</w:t>
             </w:r>
@@ -1282,15 +2154,140 @@
               <w:rPr>
                 <w:rFonts w:ascii="Calibri" w:hAnsi="Calibri"/>
                 <w:color w:val="1A1A1A"/>
-                <w:sz w:val="20"/>
+                <w:sz w:val="18"/>
               </w:rPr>
-              <w:t xml:space="preserve"> font, size, color</w:t>
+              <w:t xml:space="preserve">, </w:t>
+            </w:r>
+            <w:r>
+              <w:rPr>
+                <w:rFonts w:ascii="Calibri" w:hAnsi="Calibri"/>
+                <w:color w:val="1A1A1A"/>
+                <w:sz w:val="18"/>
+              </w:rPr>
+              <w:t>code.langs.{lang}</w:t>
+            </w:r>
+          </w:p>
+        </w:tc>
+      </w:tr>
+      <w:tr>
+        <w:tc>
+          <w:tcPr>
+            <w:tcW w:type="dxa" w:w="3456"/>
+            <w:tcMar>
+              <w:top w:w="80" w:type="dxa"/>
+              <w:bottom w:w="80" w:type="dxa"/>
+              <w:left w:w="160" w:type="dxa"/>
+              <w:right w:w="160" w:type="dxa"/>
+            </w:tcMar>
+          </w:tcPr>
+          <w:p>
+            <w:r>
+              <w:rPr>
+                <w:rFonts w:ascii="Calibri" w:hAnsi="Calibri"/>
+                <w:color w:val="1A1A1A"/>
+                <w:sz w:val="18"/>
+              </w:rPr>
+              <w:t>Images</w:t>
+            </w:r>
+          </w:p>
+        </w:tc>
+        <w:tc>
+          <w:tcPr>
+            <w:tcW w:type="dxa" w:w="3456"/>
+            <w:tcMar>
+              <w:top w:w="80" w:type="dxa"/>
+              <w:bottom w:w="80" w:type="dxa"/>
+              <w:left w:w="160" w:type="dxa"/>
+              <w:right w:w="160" w:type="dxa"/>
+            </w:tcMar>
+          </w:tcPr>
+          <w:p>
+            <w:r>
+              <w:rPr>
+                <w:rFonts w:ascii="Calibri" w:hAnsi="Calibri"/>
+                <w:color w:val="1A1A1A"/>
+                <w:sz w:val="18"/>
+              </w:rPr>
+              <w:t>![alt](path)</w:t>
+            </w:r>
+          </w:p>
+        </w:tc>
+        <w:tc>
+          <w:tcPr>
+            <w:tcW w:type="dxa" w:w="3456"/>
+            <w:tcMar>
+              <w:top w:w="80" w:type="dxa"/>
+              <w:bottom w:w="80" w:type="dxa"/>
+              <w:left w:w="160" w:type="dxa"/>
+              <w:right w:w="160" w:type="dxa"/>
+            </w:tcMar>
+          </w:tcPr>
+          <w:p>
+            <w:pPr>
+              <w:spacing w:after="0"/>
+            </w:pPr>
+            <w:r>
+              <w:rPr>
+                <w:rFonts w:ascii="Calibri" w:hAnsi="Calibri"/>
+                <w:color w:val="1A1A1A"/>
+                <w:sz w:val="18"/>
+              </w:rPr>
+              <w:t>image</w:t>
+            </w:r>
+            <w:r>
+              <w:rPr>
+                <w:rFonts w:ascii="Calibri" w:hAnsi="Calibri"/>
+                <w:color w:val="1A1A1A"/>
+                <w:sz w:val="18"/>
+              </w:rPr>
+              <w:t xml:space="preserve">, </w:t>
+            </w:r>
+            <w:r>
+              <w:rPr>
+                <w:rFonts w:ascii="Calibri" w:hAnsi="Calibri"/>
+                <w:color w:val="1A1A1A"/>
+                <w:sz w:val="18"/>
+              </w:rPr>
+              <w:t>width</w:t>
+            </w:r>
+            <w:r>
+              <w:rPr>
+                <w:rFonts w:ascii="Calibri" w:hAnsi="Calibri"/>
+                <w:color w:val="1A1A1A"/>
+                <w:sz w:val="18"/>
+              </w:rPr>
+              <w:t xml:space="preserve">, </w:t>
+            </w:r>
+            <w:r>
+              <w:rPr>
+                <w:rFonts w:ascii="Calibri" w:hAnsi="Calibri"/>
+                <w:color w:val="1A1A1A"/>
+                <w:sz w:val="18"/>
+              </w:rPr>
+              <w:t>max_width</w:t>
+            </w:r>
+            <w:r>
+              <w:rPr>
+                <w:rFonts w:ascii="Calibri" w:hAnsi="Calibri"/>
+                <w:color w:val="1A1A1A"/>
+                <w:sz w:val="18"/>
+              </w:rPr>
+              <w:t xml:space="preserve">, </w:t>
+            </w:r>
+            <w:r>
+              <w:rPr>
+                <w:rFonts w:ascii="Calibri" w:hAnsi="Calibri"/>
+                <w:color w:val="1A1A1A"/>
+                <w:sz w:val="18"/>
+              </w:rPr>
+              <w:t>alt_mode</w:t>
             </w:r>
           </w:p>
         </w:tc>
       </w:tr>
     </w:tbl>
     <w:p>
+      <w:bookmarkStart w:id="10" w:name="code-blocks"/>
       <w:pPr>
         <w:pStyle w:val="Heading2"/>
         <w:pBdr>
@@ -1298,6 +2295,7 @@
         </w:pBdr>
         <w:spacing w:before="320" w:after="0"/>
       </w:pPr>
+      <w:bookmarkEnd w:id="10"/>
       <w:r>
         <w:rPr>
           <w:rFonts w:ascii="Calibri" w:hAnsi="Calibri"/>
@@ -1305,7 +2303,7 @@
           <w:color w:val="2B579A"/>
           <w:sz w:val="32"/>
         </w:rPr>
-        <w:t>Code Block</w:t>
+        <w:t>Code Blocks</w:t>
       </w:r>
     </w:p>
     <w:p>
@@ -1314,48 +2312,199 @@
         <w:spacing w:line="269" w:lineRule="auto" w:before="120" w:after="0"/>
       </w:pPr>
       <w:r>
+        <w:t xml:space="preserve">Language tags select optional overrides under </w:t>
+      </w:r>
+      <w:r>
+        <w:rPr>
+          <w:shd w:val="clear" w:color="auto" w:fill="F5F5F5"/>
+          <w:rFonts w:ascii="Consolas" w:hAnsi="Consolas"/>
+          <w:color w:val="1F497D"/>
+          <w:sz w:val="18"/>
+        </w:rPr>
+        <w:t>code.langs</w:t>
+      </w:r>
+      <w:r>
+        <w:t xml:space="preserve"> in the theme. Pipes inside fences are </w:t>
+      </w:r>
+      <w:r>
         <w:rPr>
           <w:rFonts w:ascii="Calibri" w:hAnsi="Calibri"/>
+          <w:b/>
           <w:color w:val="1A1A1A"/>
           <w:sz w:val="22"/>
         </w:rPr>
-        <w:t>The delimiter below is preserved inside fenced code:</w:t>
+        <w:t>not</w:t>
+      </w:r>
+      <w:r>
+        <w:t xml:space="preserve"> dual-align markers:</w:t>
       </w:r>
     </w:p>
     <w:p>
       <w:pPr>
-        <w:pStyle w:val="Mark2wordCode"/>
-        <w:spacing w:line="269" w:lineRule="auto" w:before="80" w:after="0"/>
+        <w:shd w:val="clear" w:color="auto" w:fill="F5F5F5"/>
+        <w:pStyle w:val="Mark2wordCodeBlock"/>
+        <w:spacing w:before="80" w:after="0"/>
       </w:pPr>
       <w:r>
         <w:rPr>
           <w:rFonts w:ascii="Consolas" w:hAnsi="Consolas"/>
-          <w:color w:val="1F497D"/>
+          <w:color w:val="000080"/>
           <w:sz w:val="18"/>
         </w:rPr>
-        <w:t># Pipes in code are not dual-alignment markers</w:t>
-        <w:br/>
+        <w:t># showcase-theme.yaml → code.langs.python</w:t>
+      </w:r>
+    </w:p>
+    <w:p>
+      <w:pPr>
+        <w:shd w:val="clear" w:color="auto" w:fill="F5F5F5"/>
+        <w:pStyle w:val="Mark2wordCodeBlock"/>
+        <w:spacing w:before="0" w:after="0"/>
+      </w:pPr>
+      <w:r>
+        <w:rPr>
+          <w:rFonts w:ascii="Consolas" w:hAnsi="Consolas"/>
+          <w:color w:val="000080"/>
+          <w:sz w:val="18"/>
+        </w:rPr>
+        <w:t>def convert(md_path: Path) -&gt; Path:</w:t>
+      </w:r>
+    </w:p>
+    <w:p>
+      <w:pPr>
+        <w:shd w:val="clear" w:color="auto" w:fill="F5F5F5"/>
+        <w:pStyle w:val="Mark2wordCodeBlock"/>
+        <w:spacing w:before="0" w:after="0"/>
+      </w:pPr>
+      <w:r>
+        <w:rPr>
+          <w:rFonts w:ascii="Consolas" w:hAnsi="Consolas"/>
+          <w:color w:val="000080"/>
+          <w:sz w:val="18"/>
+        </w:rPr>
+        <w:t xml:space="preserve">    return md_path.with_suffix(".docx")</w:t>
+      </w:r>
+    </w:p>
+    <w:p>
+      <w:pPr>
+        <w:shd w:val="clear" w:color="auto" w:fill="F5F5F5"/>
+        <w:pStyle w:val="Mark2wordCodeBlock"/>
+        <w:spacing w:before="0" w:after="0"/>
+      </w:pPr>
+      <w:r>
+        <w:rPr>
+          <w:rFonts w:ascii="Consolas" w:hAnsi="Consolas"/>
+          <w:color w:val="006666"/>
+          <w:sz w:val="18"/>
+        </w:rPr>
+        <w:t># Chained extends in showcase.md → showcase-theme.yaml → showcase-base.yaml</w:t>
+      </w:r>
+    </w:p>
+    <w:p>
+      <w:pPr>
+        <w:shd w:val="clear" w:color="auto" w:fill="F5F5F5"/>
+        <w:pStyle w:val="Mark2wordCodeBlock"/>
+        <w:spacing w:before="0" w:after="0"/>
+      </w:pPr>
+      <w:r>
+        <w:rPr>
+          <w:rFonts w:ascii="Consolas" w:hAnsi="Consolas"/>
+          <w:color w:val="006666"/>
+          <w:sz w:val="18"/>
+        </w:rPr>
+        <w:t>page:</w:t>
+      </w:r>
+    </w:p>
+    <w:p>
+      <w:pPr>
+        <w:shd w:val="clear" w:color="auto" w:fill="F5F5F5"/>
+        <w:pStyle w:val="Mark2wordCodeBlock"/>
+        <w:spacing w:before="0" w:after="0"/>
+      </w:pPr>
+      <w:r>
+        <w:rPr>
+          <w:rFonts w:ascii="Consolas" w:hAnsi="Consolas"/>
+          <w:color w:val="006666"/>
+          <w:sz w:val="18"/>
+        </w:rPr>
+        <w:t xml:space="preserve">  footer: "Style Gallery || Page {page} of {pages}"</w:t>
+      </w:r>
+    </w:p>
+    <w:p>
+      <w:pPr>
+        <w:shd w:val="clear" w:color="auto" w:fill="F5F5F5"/>
+        <w:pStyle w:val="Mark2wordCodeBlock"/>
+        <w:spacing w:before="0" w:after="0"/>
+      </w:pPr>
+      <w:r>
+        <w:rPr>
+          <w:rFonts w:ascii="Consolas" w:hAnsi="Consolas"/>
+          <w:color w:val="006666"/>
+          <w:sz w:val="18"/>
+        </w:rPr>
+        <w:t>code:</w:t>
+      </w:r>
+    </w:p>
+    <w:p>
+      <w:pPr>
+        <w:shd w:val="clear" w:color="auto" w:fill="F5F5F5"/>
+        <w:pStyle w:val="Mark2wordCodeBlock"/>
+        <w:spacing w:before="0" w:after="0"/>
+      </w:pPr>
+      <w:r>
+        <w:rPr>
+          <w:rFonts w:ascii="Consolas" w:hAnsi="Consolas"/>
+          <w:color w:val="006666"/>
+          <w:sz w:val="18"/>
+        </w:rPr>
+        <w:t xml:space="preserve">  langs:</w:t>
+      </w:r>
+    </w:p>
+    <w:p>
+      <w:pPr>
+        <w:shd w:val="clear" w:color="auto" w:fill="F5F5F5"/>
+        <w:pStyle w:val="Mark2wordCodeBlock"/>
+        <w:spacing w:before="0" w:after="0"/>
+      </w:pPr>
+      <w:r>
+        <w:rPr>
+          <w:rFonts w:ascii="Consolas" w:hAnsi="Consolas"/>
+          <w:color w:val="006666"/>
+          <w:sz w:val="18"/>
+        </w:rPr>
+        <w:t xml:space="preserve">    yaml: { color: "006666" }</w:t>
+      </w:r>
+    </w:p>
+    <w:p>
+      <w:pPr>
+        <w:pStyle w:val="Mark2wordBody"/>
+        <w:spacing w:line="269" w:lineRule="auto" w:before="0" w:after="0"/>
+      </w:pPr>
+      <w:r>
+        <w:t xml:space="preserve">And there can </w:t>
       </w:r>
       <w:r>
         <w:rPr>
+          <w:shd w:val="clear" w:color="auto" w:fill="F5F5F5"/>
           <w:rFonts w:ascii="Consolas" w:hAnsi="Consolas"/>
           <w:color w:val="1F497D"/>
           <w:sz w:val="18"/>
         </w:rPr>
-        <w:t>label = "left || right"</w:t>
-        <w:br/>
+        <w:t>be inline code sections</w:t>
       </w:r>
       <w:r>
-        <w:rPr>
-          <w:rFonts w:ascii="Consolas" w:hAnsi="Consolas"/>
-          <w:color w:val="1F497D"/>
-          <w:sz w:val="18"/>
-        </w:rPr>
-        <w:t>print(label)</w:t>
-        <w:br/>
+        <w:t xml:space="preserve"> too, and page-breaks like this:</w:t>
       </w:r>
     </w:p>
     <w:p>
+      <w:pPr>
+        <w:spacing w:before="80" w:after="0"/>
+      </w:pPr>
+      <w:r>
+        <w:br w:type="page"/>
+      </w:r>
+    </w:p>
+    <w:p>
+      <w:bookmarkStart w:id="11" w:name="theme-regions"/>
       <w:pPr>
         <w:pStyle w:val="Heading2"/>
         <w:pBdr>
@@ -1363,6 +2512,7 @@
         </w:pBdr>
         <w:spacing w:before="320" w:after="0"/>
       </w:pPr>
+      <w:bookmarkEnd w:id="11"/>
       <w:r>
         <w:rPr>
           <w:rFonts w:ascii="Calibri" w:hAnsi="Calibri"/>
@@ -1370,13 +2520,34 @@
           <w:color w:val="2B579A"/>
           <w:sz w:val="32"/>
         </w:rPr>
-        <w:t>Region/Theme Tips</w:t>
+        <w:t>Theme Regions</w:t>
       </w:r>
     </w:p>
     <w:p>
       <w:pPr>
         <w:pStyle w:val="Mark2wordBody"/>
-        <w:spacing w:line="260" w:lineRule="exact" w:before="120" w:after="0"/>
+        <w:spacing w:line="269" w:lineRule="auto" w:before="120" w:after="0"/>
+      </w:pPr>
+      <w:r>
+        <w:t xml:space="preserve">Regions wrap stretches of Markdown and apply </w:t>
+      </w:r>
+      <w:r>
+        <w:rPr>
+          <w:shd w:val="clear" w:color="auto" w:fill="F5F5F5"/>
+          <w:rFonts w:ascii="Consolas" w:hAnsi="Consolas"/>
+          <w:color w:val="1F497D"/>
+          <w:sz w:val="18"/>
+        </w:rPr>
+        <w:t>$region-name</w:t>
+      </w:r>
+      <w:r>
+        <w:t xml:space="preserve"> style blocks from the theme or frontmatter. They nest and override globals without inline formatting.</w:t>
+      </w:r>
+    </w:p>
+    <w:p>
+      <w:pPr>
+        <w:pStyle w:val="Mark2wordBody"/>
+        <w:spacing w:line="260" w:lineRule="exact" w:before="80" w:after="0"/>
         <w:ind w:left="400"/>
       </w:pPr>
       <w:r>
@@ -1394,7 +2565,7 @@
         <w:pStyle w:val="ListBullet"/>
         <w:numPr>
           <w:ilvl w:val="0"/>
-          <w:numId w:val="13"/>
+          <w:numId w:val="14"/>
         </w:numPr>
         <w:spacing w:before="40" w:after="0"/>
       </w:pPr>
@@ -1404,12 +2575,13 @@
           <w:color w:val="1F4E79"/>
           <w:sz w:val="22"/>
         </w:rPr>
-        <w:t xml:space="preserve">Quote hex colors in the YAML theme - </w:t>
+        <w:t xml:space="preserve">Quote hex colors in YAML — </w:t>
       </w:r>
       <w:r>
         <w:rPr>
-          <w:rFonts w:ascii="Consolas" w:hAnsi="Consolas"/>
-          <w:color w:val="1F497D"/>
+          <w:shd w:val="clear" w:color="auto" w:fill="F5F5F5"/>
+          <w:rFonts w:ascii="Calibri" w:hAnsi="Calibri"/>
+          <w:color w:val="1F4E79"/>
           <w:sz w:val="18"/>
         </w:rPr>
         <w:t>color: "5B5B5B"</w:t>
@@ -1420,7 +2592,7 @@
         <w:pStyle w:val="ListBullet"/>
         <w:numPr>
           <w:ilvl w:val="0"/>
-          <w:numId w:val="13"/>
+          <w:numId w:val="14"/>
         </w:numPr>
         <w:spacing w:before="20" w:after="0"/>
       </w:pPr>
@@ -1434,8 +2606,9 @@
       </w:r>
       <w:r>
         <w:rPr>
-          <w:rFonts w:ascii="Consolas" w:hAnsi="Consolas"/>
-          <w:color w:val="1F497D"/>
+          <w:shd w:val="clear" w:color="auto" w:fill="F5F5F5"/>
+          <w:rFonts w:ascii="Calibri" w:hAnsi="Calibri"/>
+          <w:color w:val="1F4E79"/>
           <w:sz w:val="18"/>
         </w:rPr>
         <w:t>text</w:t>
@@ -1454,7 +2627,59 @@
         <w:pStyle w:val="ListBullet"/>
         <w:numPr>
           <w:ilvl w:val="0"/>
-          <w:numId w:val="13"/>
+          <w:numId w:val="14"/>
+        </w:numPr>
+        <w:spacing w:before="20" w:after="0"/>
+      </w:pPr>
+      <w:r>
+        <w:rPr>
+          <w:rFonts w:ascii="Calibri" w:hAnsi="Calibri"/>
+          <w:color w:val="1F4E79"/>
+          <w:sz w:val="22"/>
+        </w:rPr>
+        <w:t xml:space="preserve">Chain </w:t>
+      </w:r>
+      <w:r>
+        <w:rPr>
+          <w:shd w:val="clear" w:color="auto" w:fill="F5F5F5"/>
+          <w:rFonts w:ascii="Calibri" w:hAnsi="Calibri"/>
+          <w:color w:val="1F4E79"/>
+          <w:sz w:val="18"/>
+        </w:rPr>
+        <w:t>extends</w:t>
+      </w:r>
+      <w:r>
+        <w:rPr>
+          <w:rFonts w:ascii="Calibri" w:hAnsi="Calibri"/>
+          <w:color w:val="1F4E79"/>
+          <w:sz w:val="22"/>
+        </w:rPr>
+        <w:t xml:space="preserve"> across theme files (see </w:t>
+      </w:r>
+      <w:r>
+        <w:rPr>
+          <w:shd w:val="clear" w:color="auto" w:fill="F5F5F5"/>
+          <w:rFonts w:ascii="Calibri" w:hAnsi="Calibri"/>
+          <w:color w:val="1F4E79"/>
+          <w:sz w:val="18"/>
+        </w:rPr>
+        <w:t>showcase-base.yaml</w:t>
+      </w:r>
+      <w:r>
+        <w:rPr>
+          <w:rFonts w:ascii="Calibri" w:hAnsi="Calibri"/>
+          <w:color w:val="1F4E79"/>
+          <w:sz w:val="22"/>
+        </w:rPr>
+        <w:t>)</w:t>
+      </w:r>
+    </w:p>
+    <w:p>
+      <w:pPr>
+        <w:pStyle w:val="ListBullet"/>
+        <w:numPr>
+          <w:ilvl w:val="0"/>
+          <w:numId w:val="14"/>
         </w:numPr>
         <w:spacing w:before="20" w:after="0"/>
       </w:pPr>
@@ -1468,8 +2693,9 @@
       </w:r>
       <w:r>
         <w:rPr>
-          <w:rFonts w:ascii="Consolas" w:hAnsi="Consolas"/>
-          <w:color w:val="1F497D"/>
+          <w:shd w:val="clear" w:color="auto" w:fill="F5F5F5"/>
+          <w:rFonts w:ascii="Georgia" w:hAnsi="Georgia"/>
+          <w:color w:val="008000"/>
           <w:sz w:val="18"/>
         </w:rPr>
         <w:t>$regions</w:t>
@@ -1488,7 +2714,7 @@
         <w:pStyle w:val="ListBullet"/>
         <w:numPr>
           <w:ilvl w:val="0"/>
-          <w:numId w:val="13"/>
+          <w:numId w:val="14"/>
         </w:numPr>
         <w:spacing w:before="20" w:after="0"/>
       </w:pPr>
@@ -1498,7 +2724,7 @@
           <w:color w:val="008000"/>
           <w:sz w:val="22"/>
         </w:rPr>
-        <w:t>Override one margin without losing the rest via frontmatter</w:t>
+        <w:t>Override one key without losing the rest of the cascade</w:t>
       </w:r>
     </w:p>
     <w:p>
@@ -1506,7 +2732,102 @@
         <w:pStyle w:val="ListBullet"/>
         <w:numPr>
           <w:ilvl w:val="0"/>
-          <w:numId w:val="13"/>
+          <w:numId w:val="14"/>
+        </w:numPr>
+        <w:spacing w:before="20" w:after="0"/>
+      </w:pPr>
+      <w:r>
+        <w:rPr>
+          <w:rFonts w:ascii="Georgia" w:hAnsi="Georgia"/>
+          <w:color w:val="008000"/>
+          <w:sz w:val="22"/>
+        </w:rPr>
+        <w:t xml:space="preserve">Validate with </w:t>
+      </w:r>
+      <w:r>
+        <w:rPr>
+          <w:shd w:val="clear" w:color="auto" w:fill="F5F5F5"/>
+          <w:rFonts w:ascii="Georgia" w:hAnsi="Georgia"/>
+          <w:color w:val="008000"/>
+          <w:sz w:val="18"/>
+        </w:rPr>
+        <w:t>uv run mark2word --check-theme showcase-theme.yaml</w:t>
+      </w:r>
+    </w:p>
+    <w:p>
+      <w:pPr>
+        <w:pStyle w:val="Mark2wordBody"/>
+        <w:spacing w:line="269" w:lineRule="auto" w:before="120" w:after="0"/>
+      </w:pPr>
+      <w:r>
+        <w:rPr>
+          <w:rFonts w:ascii="Calibri" w:hAnsi="Calibri"/>
+          <w:color w:val="1A1A1A"/>
+          <w:sz w:val="22"/>
+        </w:rPr>
+        <w:t>Per-level list colors in a region:</w:t>
+      </w:r>
+    </w:p>
+    <w:p>
+      <w:pPr>
+        <w:pStyle w:val="ListBullet"/>
+        <w:numPr>
+          <w:ilvl w:val="0"/>
+          <w:numId w:val="15"/>
+        </w:numPr>
+        <w:spacing w:before="80" w:after="0"/>
+      </w:pPr>
+      <w:r>
+        <w:rPr>
+          <w:rFonts w:ascii="Calibri" w:hAnsi="Calibri"/>
+          <w:color w:val="943634"/>
+          <w:sz w:val="22"/>
+        </w:rPr>
+        <w:t>level zero</w:t>
+      </w:r>
+    </w:p>
+    <w:p>
+      <w:pPr>
+        <w:pStyle w:val="ListBullet"/>
+        <w:numPr>
+          <w:ilvl w:val="1"/>
+          <w:numId w:val="15"/>
+        </w:numPr>
+        <w:spacing w:before="60" w:after="0"/>
+      </w:pPr>
+      <w:r>
+        <w:rPr>
+          <w:rFonts w:ascii="Calibri" w:hAnsi="Calibri"/>
+          <w:color w:val="028010"/>
+          <w:sz w:val="22"/>
+        </w:rPr>
+        <w:t>level one</w:t>
+      </w:r>
+    </w:p>
+    <w:p>
+      <w:pPr>
+        <w:pStyle w:val="ListBullet"/>
+        <w:numPr>
+          <w:ilvl w:val="2"/>
+          <w:numId w:val="15"/>
+        </w:numPr>
+        <w:spacing w:before="60" w:after="0"/>
+      </w:pPr>
+      <w:r>
+        <w:rPr>
+          <w:rFonts w:ascii="Calibri" w:hAnsi="Calibri"/>
+          <w:color w:val="1F4E79"/>
+          <w:sz w:val="22"/>
+        </w:rPr>
+        <w:t>level two</w:t>
+      </w:r>
+    </w:p>
+    <w:p>
+      <w:pPr>
+        <w:pStyle w:val="ListBullet"/>
+        <w:numPr>
+          <w:ilvl w:val="0"/>
+          <w:numId w:val="15"/>
         </w:numPr>
         <w:spacing w:before="60" w:after="0"/>
       </w:pPr>
@@ -1516,89 +2837,181 @@
           <w:color w:val="943634"/>
           <w:sz w:val="22"/>
         </w:rPr>
-        <w:t>You can even</w:t>
+        <w:t>back to zero</w:t>
+      </w:r>
+    </w:p>
+    <w:p>
+      <w:bookmarkStart w:id="12" w:name="appendix-zero-padded-numbers"/>
+      <w:pPr>
+        <w:pStyle w:val="Heading2"/>
+        <w:pBdr>
+          <w:bottom w:val="single" w:sz="6" w:space="2" w:color="2B579A"/>
+        </w:pBdr>
+        <w:spacing w:before="320" w:after="0"/>
+      </w:pPr>
+      <w:bookmarkEnd w:id="12"/>
+      <w:r>
+        <w:rPr>
+          <w:rFonts w:ascii="Calibri" w:hAnsi="Calibri"/>
+          <w:b/>
+          <w:color w:val="2B579A"/>
+          <w:sz w:val="32"/>
+        </w:rPr>
+        <w:t>Appendix: Zero-Padded Numbers</w:t>
       </w:r>
     </w:p>
     <w:p>
       <w:pPr>
-        <w:pStyle w:val="ListBullet"/>
+        <w:pStyle w:val="Mark2wordBody"/>
+        <w:spacing w:line="269" w:lineRule="auto" w:before="120" w:after="0"/>
+      </w:pPr>
+      <w:r>
+        <w:rPr>
+          <w:rFonts w:ascii="Calibri" w:hAnsi="Calibri"/>
+          <w:color w:val="404040"/>
+          <w:sz w:val="20"/>
+        </w:rPr>
+        <w:t xml:space="preserve">The </w:t>
+      </w:r>
+      <w:r>
+        <w:rPr>
+          <w:shd w:val="clear" w:color="auto" w:fill="F5F5F5"/>
+          <w:rFonts w:ascii="Consolas" w:hAnsi="Consolas"/>
+          <w:color w:val="1F497D"/>
+          <w:sz w:val="18"/>
+        </w:rPr>
+        <w:t>$appendix</w:t>
+      </w:r>
+      <w:r>
+        <w:rPr>
+          <w:rFonts w:ascii="Calibri" w:hAnsi="Calibri"/>
+          <w:color w:val="404040"/>
+          <w:sz w:val="20"/>
+        </w:rPr>
+        <w:t xml:space="preserve"> region sets </w:t>
+      </w:r>
+      <w:r>
+        <w:rPr>
+          <w:shd w:val="clear" w:color="auto" w:fill="F5F5F5"/>
+          <w:rFonts w:ascii="Consolas" w:hAnsi="Consolas"/>
+          <w:color w:val="1F497D"/>
+          <w:sz w:val="18"/>
+        </w:rPr>
+        <w:t>ol.levels.0.format: "01."</w:t>
+      </w:r>
+      <w:r>
+        <w:rPr>
+          <w:rFonts w:ascii="Calibri" w:hAnsi="Calibri"/>
+          <w:color w:val="404040"/>
+          <w:sz w:val="20"/>
+        </w:rPr>
+        <w:t xml:space="preserve"> for formal enumerations:</w:t>
+      </w:r>
+    </w:p>
+    <w:p>
+      <w:pPr>
+        <w:pStyle w:val="ListNumber"/>
         <w:numPr>
-          <w:ilvl w:val="1"/>
-          <w:numId w:val="13"/>
+          <w:ilvl w:val="0"/>
+          <w:numId w:val="16"/>
+        </w:numPr>
+        <w:spacing w:before="80" w:after="0"/>
+      </w:pPr>
+      <w:r>
+        <w:rPr>
+          <w:rFonts w:ascii="Calibri" w:hAnsi="Calibri"/>
+          <w:color w:val="1A1A1A"/>
+          <w:sz w:val="22"/>
+        </w:rPr>
+        <w:t>First appendix item</w:t>
+      </w:r>
+    </w:p>
+    <w:p>
+      <w:pPr>
+        <w:pStyle w:val="ListNumber"/>
+        <w:numPr>
+          <w:ilvl w:val="0"/>
+          <w:numId w:val="16"/>
         </w:numPr>
         <w:spacing w:before="60" w:after="0"/>
       </w:pPr>
       <w:r>
         <w:rPr>
           <w:rFonts w:ascii="Calibri" w:hAnsi="Calibri"/>
-          <w:color w:val="028010"/>
+          <w:color w:val="1A1A1A"/>
           <w:sz w:val="22"/>
         </w:rPr>
-        <w:t>have different</w:t>
+        <w:t>Second appendix item</w:t>
       </w:r>
     </w:p>
     <w:p>
       <w:pPr>
-        <w:pStyle w:val="ListBullet"/>
+        <w:pStyle w:val="ListNumber"/>
         <w:numPr>
-          <w:ilvl w:val="2"/>
-          <w:numId w:val="13"/>
+          <w:ilvl w:val="0"/>
+          <w:numId w:val="16"/>
         </w:numPr>
         <w:spacing w:before="60" w:after="0"/>
       </w:pPr>
       <w:r>
         <w:rPr>
           <w:rFonts w:ascii="Calibri" w:hAnsi="Calibri"/>
-          <w:color w:val="1F4E79"/>
+          <w:color w:val="1A1A1A"/>
           <w:sz w:val="22"/>
         </w:rPr>
-        <w:t>styles for</w:t>
-      </w:r>
-    </w:p>
-    <w:p>
-      <w:pPr>
-        <w:pStyle w:val="ListBullet"/>
-        <w:numPr>
-          <w:ilvl w:val="1"/>
-          <w:numId w:val="13"/>
-        </w:numPr>
-        <w:spacing w:before="60" w:after="0"/>
-      </w:pPr>
-      <w:r>
-        <w:rPr>
-          <w:rFonts w:ascii="Calibri" w:hAnsi="Calibri"/>
-          <w:color w:val="028010"/>
-          <w:sz w:val="22"/>
-        </w:rPr>
-        <w:t>each level</w:t>
-      </w:r>
-    </w:p>
-    <w:p>
-      <w:pPr>
-        <w:pStyle w:val="ListBullet"/>
-        <w:numPr>
-          <w:ilvl w:val="0"/>
-          <w:numId w:val="13"/>
-        </w:numPr>
-        <w:spacing w:before="60" w:after="0"/>
-      </w:pPr>
-      <w:r>
-        <w:rPr>
-          <w:rFonts w:ascii="Calibri" w:hAnsi="Calibri"/>
-          <w:color w:val="943634"/>
-          <w:sz w:val="22"/>
-        </w:rPr>
-        <w:t>of list nesting!</w:t>
+        <w:t>Third appendix item</w:t>
       </w:r>
     </w:p>
     <w:p>
       <w:pPr>
         <w:pStyle w:val="Mark2wordBody"/>
+        <w:spacing w:line="269" w:lineRule="auto" w:before="280" w:after="0"/>
+        <w:pBdr>
+          <w:bottom w:val="single" w:sz="6" w:space="2" w:color="2B579A"/>
+        </w:pBdr>
+      </w:pPr>
+    </w:p>
+    <w:p>
+      <w:pPr>
+        <w:pStyle w:val="Mark2wordBody"/>
+        <w:spacing w:line="269" w:lineRule="auto" w:before="280" w:after="0"/>
+      </w:pPr>
+      <w:r>
+        <w:rPr>
+          <w:rFonts w:ascii="Calibri" w:hAnsi="Calibri"/>
+          <w:i/>
+          <w:color w:val="1A1A1A"/>
+          <w:sz w:val="22"/>
+        </w:rPr>
+        <w:t xml:space="preserve">End of gallery body. The line below is a styled region, not the Word page footer (see theme </w:t>
+      </w:r>
+      <w:r>
+        <w:rPr>
+          <w:shd w:val="clear" w:color="auto" w:fill="F5F5F5"/>
+          <w:rFonts w:ascii="Consolas" w:hAnsi="Consolas"/>
+          <w:color w:val="1F497D"/>
+          <w:sz w:val="18"/>
+        </w:rPr>
+        <w:t>page.footer</w:t>
+      </w:r>
+      <w:r>
+        <w:rPr>
+          <w:rFonts w:ascii="Calibri" w:hAnsi="Calibri"/>
+          <w:i/>
+          <w:color w:val="1A1A1A"/>
+          <w:sz w:val="22"/>
+        </w:rPr>
+        <w:t>).</w:t>
+      </w:r>
+    </w:p>
+    <w:p>
+      <w:pPr>
+        <w:pStyle w:val="Mark2wordBody"/>
+        <w:spacing w:line="269" w:lineRule="auto" w:before="240" w:after="80"/>
+        <w:jc w:val="left"/>
         <w:tabs>
-          <w:tab w:pos="10080" w:val="right"/>
+          <w:tab w:val="right" w:leader="none" w:pos="10368"/>
         </w:tabs>
-        <w:spacing w:line="269" w:lineRule="auto" w:before="200" w:after="80"/>
-        <w:jc w:val="center"/>
       </w:pPr>
       <w:r>
         <w:rPr>
@@ -1621,8 +3034,10 @@
       </w:r>
     </w:p>
     <w:sectPr>
+      <w:headerReference w:type="default" r:id="rId9"/>
+      <w:footerReference w:type="default" r:id="rId10"/>
       <w:pgSz w:w="12240" w:h="15840"/>
-      <w:pgMar w:top="864" w:right="1080" w:bottom="864" w:left="1080" w:header="720" w:footer="720" w:gutter="0"/>
+      <w:pgMar w:top="1080" w:right="936" w:bottom="936" w:left="936" w:header="720" w:footer="720" w:gutter="0"/>
       <w:cols w:space="720"/>
       <w:docGrid w:linePitch="360"/>
     </w:sectPr>
@@ -1630,14 +3045,165 @@
 </w:document>
 </file>
 
+<file path=word/footer1.xml><?xml version="1.0" encoding="utf-8"?>
+<w:ftr xmlns:m="http://schemas.openxmlformats.org/officeDocument/2006/math" xmlns:mc="http://schemas.openxmlformats.org/markup-compatibility/2006" xmlns:mo="http://schemas.microsoft.com/office/mac/office/2008/main" xmlns:mv="urn:schemas-microsoft-com:mac:vml" xmlns:o="urn:schemas-microsoft-com:office:office" xmlns:r="http://schemas.openxmlformats.org/officeDocument/2006/relationships" xmlns:v="urn:schemas-microsoft-com:vml" xmlns:w10="urn:schemas-microsoft-com:office:word" xmlns:w14="http://schemas.microsoft.com/office/word/2010/wordml" xmlns:w="http://schemas.openxmlformats.org/wordprocessingml/2006/main" xmlns:wne="http://schemas.microsoft.com/office/word/2006/wordml" xmlns:wp14="http://schemas.microsoft.com/office/word/2010/wordprocessingDrawing" xmlns:wp="http://schemas.openxmlformats.org/drawingml/2006/wordprocessingDrawing" xmlns:wpc="http://schemas.microsoft.com/office/word/2010/wordprocessingCanvas" xmlns:wpg="http://schemas.microsoft.com/office/word/2010/wordprocessingGroup" xmlns:wpi="http://schemas.microsoft.com/office/word/2010/wordprocessingInk" xmlns:wps="http://schemas.microsoft.com/office/word/2010/wordprocessingShape" mc:Ignorable="w14 wp14">
+  <w:p>
+    <w:pPr>
+      <w:pStyle w:val="Footer"/>
+      <w:jc w:val="left"/>
+      <w:tabs>
+        <w:tab w:val="clear" w:pos="4680"/>
+        <w:tab w:val="clear" w:pos="9360"/>
+        <w:tab w:val="right" w:leader="none" w:pos="10368"/>
+      </w:tabs>
+    </w:pPr>
+    <w:r/>
+    <w:r>
+      <w:t xml:space="preserve">Style Gallery · showcase.md</w:t>
+    </w:r>
+    <w:r>
+      <w:tab/>
+    </w:r>
+    <w:r>
+      <w:t xml:space="preserve">Page </w:t>
+    </w:r>
+    <w:r>
+      <w:fldChar w:fldCharType="begin"/>
+      <w:instrText xml:space="preserve"> PAGE </w:instrText>
+      <w:fldChar w:fldCharType="separate"/>
+      <w:fldChar w:fldCharType="end"/>
+    </w:r>
+    <w:r>
+      <w:t xml:space="preserve"> of </w:t>
+    </w:r>
+    <w:r>
+      <w:fldChar w:fldCharType="begin"/>
+      <w:instrText xml:space="preserve"> NUMPAGES </w:instrText>
+      <w:fldChar w:fldCharType="separate"/>
+      <w:fldChar w:fldCharType="end"/>
+    </w:r>
+  </w:p>
+</w:ftr>
+</file>
+
+<file path=word/header1.xml><?xml version="1.0" encoding="utf-8"?>
+<w:hdr xmlns:m="http://schemas.openxmlformats.org/officeDocument/2006/math" xmlns:mc="http://schemas.openxmlformats.org/markup-compatibility/2006" xmlns:mo="http://schemas.microsoft.com/office/mac/office/2008/main" xmlns:mv="urn:schemas-microsoft-com:mac:vml" xmlns:o="urn:schemas-microsoft-com:office:office" xmlns:r="http://schemas.openxmlformats.org/officeDocument/2006/relationships" xmlns:v="urn:schemas-microsoft-com:vml" xmlns:w10="urn:schemas-microsoft-com:office:word" xmlns:w14="http://schemas.microsoft.com/office/word/2010/wordml" xmlns:w="http://schemas.openxmlformats.org/wordprocessingml/2006/main" xmlns:wne="http://schemas.microsoft.com/office/word/2006/wordml" xmlns:wp14="http://schemas.microsoft.com/office/word/2010/wordprocessingDrawing" xmlns:wp="http://schemas.openxmlformats.org/drawingml/2006/wordprocessingDrawing" xmlns:wpc="http://schemas.microsoft.com/office/word/2010/wordprocessingCanvas" xmlns:wpg="http://schemas.microsoft.com/office/word/2010/wordprocessingGroup" xmlns:wpi="http://schemas.microsoft.com/office/word/2010/wordprocessingInk" xmlns:wps="http://schemas.microsoft.com/office/word/2010/wordprocessingShape" mc:Ignorable="w14 wp14">
+  <w:p>
+    <w:pPr>
+      <w:pStyle w:val="Header"/>
+      <w:jc w:val="left"/>
+      <w:tabs>
+        <w:tab w:val="clear" w:pos="4680"/>
+        <w:tab w:val="clear" w:pos="9360"/>
+        <w:tab w:val="right" w:leader="none" w:pos="10368"/>
+      </w:tabs>
+    </w:pPr>
+    <w:r/>
+    <w:r>
+      <w:t xml:space="preserve">mark2word</w:t>
+    </w:r>
+    <w:r>
+      <w:tab/>
+    </w:r>
+    <w:r>
+      <w:t xml:space="preserve">mark2word Style Gallery</w:t>
+    </w:r>
+  </w:p>
+</w:hdr>
+</file>
+
 <file path=word/numbering.xml><?xml version="1.0" encoding="utf-8"?>
 <w:numbering xmlns:wpc="http://schemas.microsoft.com/office/word/2010/wordprocessingCanvas" xmlns:mo="http://schemas.microsoft.com/office/mac/office/2008/main" xmlns:mc="http://schemas.openxmlformats.org/markup-compatibility/2006" xmlns:mv="urn:schemas-microsoft-com:mac:vml" xmlns:o="urn:schemas-microsoft-com:office:office" xmlns:r="http://schemas.openxmlformats.org/officeDocument/2006/relationships" xmlns:m="http://schemas.openxmlformats.org/officeDocument/2006/math" xmlns:v="urn:schemas-microsoft-com:vml" xmlns:wp14="http://schemas.microsoft.com/office/word/2010/wordprocessingDrawing" xmlns:wp="http://schemas.openxmlformats.org/drawingml/2006/wordprocessingDrawing" xmlns:w10="urn:schemas-microsoft-com:office:word" xmlns:w="http://schemas.openxmlformats.org/wordprocessingml/2006/main" xmlns:w14="http://schemas.microsoft.com/office/word/2010/wordml" xmlns:wpg="http://schemas.microsoft.com/office/word/2010/wordprocessingGroup" xmlns:wpi="http://schemas.microsoft.com/office/word/2010/wordprocessingInk" xmlns:wne="http://schemas.microsoft.com/office/word/2006/wordml" xmlns:wps="http://schemas.microsoft.com/office/word/2010/wordprocessingShape" mc:Ignorable="w14 wp14">
+  <w:abstractNum w:abstractNumId="12">
+    <w:multiLevelType w:val="multilevel"/>
+    <w:lvl w:ilvl="0">
+      <w:start w:val="1"/>
+      <w:numFmt w:val="decimalZero"/>
+      <w:lvlText w:val="%1."/>
+      <w:lvlJc w:val="left"/>
+      <w:pPr>
+        <w:ind w:left="280" w:hanging="280"/>
+      </w:pPr>
+    </w:lvl>
+    <w:lvl w:ilvl="1">
+      <w:start w:val="1"/>
+      <w:numFmt w:val="lowerLetter"/>
+      <w:lvlText w:val="%2."/>
+      <w:lvlJc w:val="left"/>
+      <w:pPr>
+        <w:ind w:left="560" w:hanging="280"/>
+      </w:pPr>
+    </w:lvl>
+    <w:lvl w:ilvl="2">
+      <w:start w:val="1"/>
+      <w:numFmt w:val="lowerRoman"/>
+      <w:lvlText w:val="%3."/>
+      <w:lvlJc w:val="left"/>
+      <w:pPr>
+        <w:ind w:left="840" w:hanging="280"/>
+      </w:pPr>
+    </w:lvl>
+    <w:lvl w:ilvl="3">
+      <w:start w:val="1"/>
+      <w:numFmt w:val="decimal"/>
+      <w:lvlText w:val="%4."/>
+      <w:lvlJc w:val="left"/>
+      <w:pPr>
+        <w:ind w:left="1120" w:hanging="280"/>
+      </w:pPr>
+    </w:lvl>
+    <w:lvl w:ilvl="4">
+      <w:start w:val="1"/>
+      <w:numFmt w:val="decimal"/>
+      <w:lvlText w:val="%5."/>
+      <w:lvlJc w:val="left"/>
+      <w:pPr>
+        <w:ind w:left="1400" w:hanging="280"/>
+      </w:pPr>
+    </w:lvl>
+    <w:lvl w:ilvl="5">
+      <w:start w:val="1"/>
+      <w:numFmt w:val="decimal"/>
+      <w:lvlText w:val="%6."/>
+      <w:lvlJc w:val="left"/>
+      <w:pPr>
+        <w:ind w:left="1680" w:hanging="280"/>
+      </w:pPr>
+    </w:lvl>
+    <w:lvl w:ilvl="6">
+      <w:start w:val="1"/>
+      <w:numFmt w:val="decimal"/>
+      <w:lvlText w:val="%7."/>
+      <w:lvlJc w:val="left"/>
+      <w:pPr>
+        <w:ind w:left="1960" w:hanging="280"/>
+      </w:pPr>
+    </w:lvl>
+    <w:lvl w:ilvl="7">
+      <w:start w:val="1"/>
+      <w:numFmt w:val="decimal"/>
+      <w:lvlText w:val="%8."/>
+      <w:lvlJc w:val="left"/>
+      <w:pPr>
+        <w:ind w:left="2240" w:hanging="280"/>
+      </w:pPr>
+    </w:lvl>
+    <w:lvl w:ilvl="8">
+      <w:start w:val="1"/>
+      <w:numFmt w:val="decimal"/>
+      <w:lvlText w:val="%9."/>
+      <w:lvlJc w:val="left"/>
+      <w:pPr>
+        <w:ind w:left="2520" w:hanging="280"/>
+      </w:pPr>
+    </w:lvl>
+  </w:abstractNum>
   <w:abstractNum w:abstractNumId="11">
     <w:multiLevelType w:val="multilevel"/>
     <w:lvl w:ilvl="0">
       <w:start w:val="1"/>
       <w:numFmt w:val="bullet"/>
-      <w:lvlText w:val="•"/>
+      <w:lvlText w:val="*"/>
       <w:lvlJc w:val="left"/>
       <w:pPr>
         <w:ind w:left="200" w:hanging="200"/>
@@ -1646,19 +3212,19 @@
     <w:lvl w:ilvl="1">
       <w:start w:val="1"/>
       <w:numFmt w:val="bullet"/>
-      <w:lvlText w:val="•"/>
+      <w:lvlText w:val="o"/>
       <w:lvlJc w:val="left"/>
       <w:pPr>
-        <w:ind w:left="400" w:hanging="200"/>
+        <w:ind w:left="480" w:hanging="200"/>
       </w:pPr>
     </w:lvl>
     <w:lvl w:ilvl="2">
       <w:start w:val="1"/>
       <w:numFmt w:val="bullet"/>
-      <w:lvlText w:val="•"/>
+      <w:lvlText w:val="-"/>
       <w:lvlJc w:val="left"/>
       <w:pPr>
-        <w:ind w:left="600" w:hanging="200"/>
+        <w:ind w:left="760" w:hanging="200"/>
       </w:pPr>
     </w:lvl>
     <w:lvl w:ilvl="3">
@@ -1667,7 +3233,7 @@
       <w:lvlText w:val="•"/>
       <w:lvlJc w:val="left"/>
       <w:pPr>
-        <w:ind w:left="800" w:hanging="200"/>
+        <w:ind w:left="1040" w:hanging="200"/>
       </w:pPr>
     </w:lvl>
     <w:lvl w:ilvl="4">
@@ -1676,7 +3242,7 @@
       <w:lvlText w:val="•"/>
       <w:lvlJc w:val="left"/>
       <w:pPr>
-        <w:ind w:left="1000" w:hanging="200"/>
+        <w:ind w:left="1320" w:hanging="200"/>
       </w:pPr>
     </w:lvl>
     <w:lvl w:ilvl="5">
@@ -1685,7 +3251,7 @@
       <w:lvlText w:val="•"/>
       <w:lvlJc w:val="left"/>
       <w:pPr>
-        <w:ind w:left="1200" w:hanging="200"/>
+        <w:ind w:left="1600" w:hanging="200"/>
       </w:pPr>
     </w:lvl>
     <w:lvl w:ilvl="6">
@@ -1694,7 +3260,7 @@
       <w:lvlText w:val="•"/>
       <w:lvlJc w:val="left"/>
       <w:pPr>
-        <w:ind w:left="1400" w:hanging="200"/>
+        <w:ind w:left="1880" w:hanging="200"/>
       </w:pPr>
     </w:lvl>
     <w:lvl w:ilvl="7">
@@ -1703,7 +3269,7 @@
       <w:lvlText w:val="•"/>
       <w:lvlJc w:val="left"/>
       <w:pPr>
-        <w:ind w:left="1600" w:hanging="200"/>
+        <w:ind w:left="2160" w:hanging="200"/>
       </w:pPr>
     </w:lvl>
     <w:lvl w:ilvl="8">
@@ -1712,7 +3278,7 @@
       <w:lvlText w:val="•"/>
       <w:lvlJc w:val="left"/>
       <w:pPr>
-        <w:ind w:left="1800" w:hanging="200"/>
+        <w:ind w:left="2440" w:hanging="200"/>
       </w:pPr>
     </w:lvl>
   </w:abstractNum>
@@ -1729,7 +3295,7 @@
     </w:lvl>
     <w:lvl w:ilvl="1">
       <w:start w:val="1"/>
-      <w:numFmt w:val="decimal"/>
+      <w:numFmt w:val="lowerLetter"/>
       <w:lvlText w:val="%2."/>
       <w:lvlJc w:val="left"/>
       <w:pPr>
@@ -1738,7 +3304,7 @@
     </w:lvl>
     <w:lvl w:ilvl="2">
       <w:start w:val="1"/>
-      <w:numFmt w:val="decimal"/>
+      <w:numFmt w:val="lowerRoman"/>
       <w:lvlText w:val="%3."/>
       <w:lvlJc w:val="left"/>
       <w:pPr>
@@ -1805,7 +3371,7 @@
     <w:lvl w:ilvl="0">
       <w:start w:val="1"/>
       <w:numFmt w:val="bullet"/>
-      <w:lvlText w:val="•"/>
+      <w:lvlText w:val="*"/>
       <w:lvlJc w:val="left"/>
       <w:pPr>
         <w:ind w:left="280" w:hanging="280"/>
@@ -1814,7 +3380,7 @@
     <w:lvl w:ilvl="1">
       <w:start w:val="1"/>
       <w:numFmt w:val="bullet"/>
-      <w:lvlText w:val="•"/>
+      <w:lvlText w:val="o"/>
       <w:lvlJc w:val="left"/>
       <w:pPr>
         <w:ind w:left="560" w:hanging="280"/>
@@ -1823,7 +3389,7 @@
     <w:lvl w:ilvl="2">
       <w:start w:val="1"/>
       <w:numFmt w:val="bullet"/>
-      <w:lvlText w:val="•"/>
+      <w:lvlText w:val="-"/>
       <w:lvlJc w:val="left"/>
       <w:pPr>
         <w:ind w:left="840" w:hanging="280"/>
@@ -2086,16 +3652,25 @@
     <w:abstractNumId w:val="9"/>
   </w:num>
   <w:num w:numId="11">
+    <w:abstractNumId w:val="9"/>
+  </w:num>
+  <w:num w:numId="12">
     <w:abstractNumId w:val="10"/>
   </w:num>
-  <w:num w:numId="12">
+  <w:num w:numId="13">
     <w:abstractNumId w:val="10"/>
     <w:lvlOverride w:ilvl="0">
       <w:startOverride w:val="9"/>
     </w:lvlOverride>
   </w:num>
-  <w:num w:numId="13">
+  <w:num w:numId="14">
     <w:abstractNumId w:val="11"/>
+  </w:num>
+  <w:num w:numId="15">
+    <w:abstractNumId w:val="9"/>
+  </w:num>
+  <w:num w:numId="16">
+    <w:abstractNumId w:val="12"/>
   </w:num>
 </w:numbering>
 </file>
@@ -2277,10 +3852,6 @@
     <w:unhideWhenUsed/>
     <w:rsid w:val="00E618BF"/>
     <w:pPr>
-      <w:tabs>
-        <w:tab w:val="center" w:pos="4680"/>
-        <w:tab w:val="right" w:pos="9360"/>
-      </w:tabs>
       <w:spacing w:after="0" w:line="240" w:lineRule="auto"/>
     </w:pPr>
   </w:style>
@@ -2299,10 +3870,6 @@
     <w:unhideWhenUsed/>
     <w:rsid w:val="00E618BF"/>
     <w:pPr>
-      <w:tabs>
-        <w:tab w:val="center" w:pos="4680"/>
-        <w:tab w:val="right" w:pos="9360"/>
-      </w:tabs>
       <w:spacing w:after="0" w:line="240" w:lineRule="auto"/>
     </w:pPr>
   </w:style>
@@ -13970,10 +15537,11 @@
       <w:sz w:val="22"/>
     </w:rPr>
   </w:style>
-  <w:style w:type="paragraph" w:styleId="Mark2wordCode">
-    <w:name w:val="Mark2word Code"/>
+  <w:style w:type="paragraph" w:styleId="Mark2wordCodeBlock">
+    <w:name w:val="Mark2word Code Block"/>
     <w:basedOn w:val="Normal"/>
     <w:pPr>
+      <w:shd w:val="clear" w:color="auto" w:fill="F5F5F5"/>
       <w:spacing w:before="0" w:after="0"/>
     </w:pPr>
     <w:rPr>

</xml_diff>